<commit_message>
Incorpora conteúdo do curso de dosimetria ao manual do PAR
Adiciona ao manual (.md e .docx):
- Seção 21: Casos Especiais (empresa sem defesa, piso R$ 6k, estimativa
  fundamentada, retroação IPCA, sucessão empresarial, grupo econômico)
- Seção 22: Estudos de Caso Comentados (Casos I a IV com números reais)
  cobrindo piso forçado, empresa fantasma e estimativa por capital social
- Nuances práticas por etapa: cumulatividade do Art. 22 IV, PAR em
  andamento ≠ reincidência, proporcionalidade da publicação no Cenário B
- FAQ expandido com as principais dúvidas operacionais
- Correção do badge() no gerador Word (RGBColor indexação)

https://claude.ai/code/session_01GAjRh6KCPWWMhHbtvEWb7e
</commit_message>
<xml_diff>
--- a/Manual_Calculadora_PAR.docx
+++ b/Manual_Calculadora_PAR.docx
@@ -10470,6 +10470,3623 @@
         <w:t>O prazo máximo é de 135 dias corridos, aplicável quando a Alíquota de Referência superar 17,5%. Para alíquotas até 2,5%, o prazo mínimo é de 30 dias.</w:t>
       </w:r>
     </w:p>
+    <w:p>
+      <w:pPr>
+        <w:spacing w:before="240" w:after="80"/>
+        <w:pBdr>
+          <w:bottom w:val="single" w:sz="6" w:space="1" w:color="64A70B"/>
+        </w:pBdr>
+      </w:pPr>
+      <w:r>
+        <w:rPr>
+          <w:rFonts w:ascii="Arial" w:hAnsi="Arial"/>
+          <w:b/>
+          <w:color w:val="1D3A78"/>
+          <w:sz w:val="23"/>
+        </w:rPr>
+        <w:t>O Art. 22, IV se aplica quando a Liquidez Geral é 0,98 mas os demais indicadores são favoráveis?</w:t>
+      </w:r>
+    </w:p>
+    <w:p>
+      <w:pPr>
+        <w:spacing w:before="0" w:after="80"/>
+      </w:pPr>
+      <w:r>
+        <w:rPr>
+          <w:rFonts w:ascii="Arial" w:hAnsi="Arial"/>
+          <w:i w:val="0"/>
+          <w:sz w:val="22"/>
+        </w:rPr>
+        <w:t>Não. O agravante de situação econômica exige os três indicadores cumulativamente: Solvência Geral &gt; 1, Liquidez Geral &gt; 1 e Lucro Líquido positivo. Qualquer indicador abaixo do limiar — ainda que por margem ínfima — zera o agravante.</w:t>
+      </w:r>
+    </w:p>
+    <w:p>
+      <w:pPr>
+        <w:spacing w:before="240" w:after="80"/>
+        <w:pBdr>
+          <w:bottom w:val="single" w:sz="6" w:space="1" w:color="64A70B"/>
+        </w:pBdr>
+      </w:pPr>
+      <w:r>
+        <w:rPr>
+          <w:rFonts w:ascii="Arial" w:hAnsi="Arial"/>
+          <w:b/>
+          <w:color w:val="1D3A78"/>
+          <w:sz w:val="23"/>
+        </w:rPr>
+        <w:t>Responder a outro PAR em andamento configura reincidência?</w:t>
+      </w:r>
+    </w:p>
+    <w:p>
+      <w:pPr>
+        <w:spacing w:before="0" w:after="80"/>
+      </w:pPr>
+      <w:r>
+        <w:rPr>
+          <w:rFonts w:ascii="Arial" w:hAnsi="Arial"/>
+          <w:i w:val="0"/>
+          <w:sz w:val="22"/>
+        </w:rPr>
+        <w:t>Não. A reincidência (Art. 22, V) exige decisão definitiva anterior. Estar respondendo a outro PAR sem julgamento concluído não configura reincidência, pois o marco legal é a publicação do julgamento anterior, não a instauração de novo processo.</w:t>
+      </w:r>
+    </w:p>
+    <w:p>
+      <w:pPr>
+        <w:spacing w:before="240" w:after="80"/>
+        <w:pBdr>
+          <w:bottom w:val="single" w:sz="6" w:space="1" w:color="64A70B"/>
+        </w:pBdr>
+      </w:pPr>
+      <w:r>
+        <w:rPr>
+          <w:rFonts w:ascii="Arial" w:hAnsi="Arial"/>
+          <w:b/>
+          <w:color w:val="1D3A78"/>
+          <w:sz w:val="23"/>
+        </w:rPr>
+        <w:t>Como é calculada a publicação quando a multa é ajustada pelo piso legal?</w:t>
+      </w:r>
+    </w:p>
+    <w:p>
+      <w:pPr>
+        <w:spacing w:before="0" w:after="80"/>
+      </w:pPr>
+      <w:r>
+        <w:rPr>
+          <w:rFonts w:ascii="Arial" w:hAnsi="Arial"/>
+          <w:i w:val="0"/>
+          <w:sz w:val="22"/>
+        </w:rPr>
+        <w:t>Quando a multa final é elevada ao valor da vantagem auferida (piso), aplica-se o Cenário B: Alíquota de Referência = (Multa Final ÷ Faturamento Bruto) × 100. Isso garante que o prazo de publicação reflita a gravidade proporcional real da sanção.</w:t>
+      </w:r>
+    </w:p>
+    <w:p>
+      <w:r>
+        <w:br w:type="page"/>
+      </w:r>
+    </w:p>
+    <w:tbl>
+      <w:tblPr>
+        <w:tblStyle w:val="TableGrid"/>
+        <w:tblW w:type="auto" w:w="0"/>
+        <w:jc w:val="left"/>
+        <w:tblLook w:firstColumn="1" w:firstRow="1" w:lastColumn="0" w:lastRow="0" w:noHBand="0" w:noVBand="1" w:val="04A0"/>
+      </w:tblPr>
+      <w:tblGrid>
+        <w:gridCol w:w="9405"/>
+      </w:tblGrid>
+      <w:tr>
+        <w:tc>
+          <w:tcPr>
+            <w:tcW w:type="dxa" w:w="9405"/>
+            <w:shd w:val="clear" w:color="auto" w:fill="00205B"/>
+            <w:tcBorders>
+              <w:top w:val="none"/>
+              <w:left w:val="none"/>
+              <w:bottom w:val="none"/>
+              <w:right w:val="none"/>
+              <w:insideH w:val="none"/>
+              <w:insideV w:val="none"/>
+            </w:tcBorders>
+            <w:tcBorders>
+              <w:top w:val="none"/>
+              <w:left w:val="none"/>
+              <w:bottom w:val="none"/>
+              <w:right w:val="none"/>
+              <w:insideH w:val="none"/>
+              <w:insideV w:val="none"/>
+            </w:tcBorders>
+            <w:tcBorders>
+              <w:top w:val="none"/>
+              <w:left w:val="none"/>
+              <w:bottom w:val="none"/>
+              <w:right w:val="none"/>
+              <w:insideH w:val="none"/>
+              <w:insideV w:val="none"/>
+            </w:tcBorders>
+            <w:tcBorders>
+              <w:top w:val="none"/>
+              <w:left w:val="none"/>
+              <w:bottom w:val="none"/>
+              <w:right w:val="none"/>
+              <w:insideH w:val="none"/>
+              <w:insideV w:val="none"/>
+            </w:tcBorders>
+          </w:tcPr>
+          <w:p>
+            <w:pPr>
+              <w:spacing w:before="0" w:after="0"/>
+              <w:ind w:left="170"/>
+            </w:pPr>
+            <w:r>
+              <w:rPr>
+                <w:rFonts w:ascii="Arial" w:hAnsi="Arial"/>
+                <w:b/>
+                <w:color w:val="FFFFFF"/>
+                <w:sz w:val="26"/>
+              </w:rPr>
+              <w:t>13. CASOS ESPECIAIS E SITUAÇÕES ATÍPICAS</w:t>
+            </w:r>
+          </w:p>
+        </w:tc>
+      </w:tr>
+    </w:tbl>
+    <w:p/>
+    <w:p>
+      <w:pPr>
+        <w:spacing w:before="240" w:after="80"/>
+        <w:pBdr>
+          <w:bottom w:val="single" w:sz="6" w:space="1" w:color="64A70B"/>
+        </w:pBdr>
+      </w:pPr>
+      <w:r>
+        <w:rPr>
+          <w:rFonts w:ascii="Arial" w:hAnsi="Arial"/>
+          <w:b/>
+          <w:color w:val="1D3A78"/>
+          <w:sz w:val="23"/>
+        </w:rPr>
+        <w:t>13.1 Empresa sem Defesa Escrita ou sem Balanço Apresentado</w:t>
+      </w:r>
+    </w:p>
+    <w:p>
+      <w:pPr>
+        <w:spacing w:before="0" w:after="80"/>
+      </w:pPr>
+      <w:r>
+        <w:rPr>
+          <w:rFonts w:ascii="Arial" w:hAnsi="Arial"/>
+          <w:i w:val="0"/>
+          <w:sz w:val="22"/>
+        </w:rPr>
+        <w:t>Quando a PJ não apresenta defesa escrita nem documentação contábil, o operador deve buscar dados em sistemas internos antes de qualquer outra medida:</w:t>
+      </w:r>
+    </w:p>
+    <w:tbl>
+      <w:tblPr>
+        <w:tblStyle w:val="TableGrid"/>
+        <w:tblW w:type="auto" w:w="0"/>
+        <w:jc w:val="left"/>
+        <w:tblLook w:firstColumn="1" w:firstRow="1" w:lastColumn="0" w:lastRow="0" w:noHBand="0" w:noVBand="1" w:val="04A0"/>
+      </w:tblPr>
+      <w:tblGrid>
+        <w:gridCol w:w="4702"/>
+        <w:gridCol w:w="4702"/>
+      </w:tblGrid>
+      <w:tr>
+        <w:tc>
+          <w:tcPr>
+            <w:tcW w:type="dxa" w:w="3402"/>
+            <w:shd w:val="clear" w:color="auto" w:fill="00205B"/>
+          </w:tcPr>
+          <w:p>
+            <w:pPr>
+              <w:jc w:val="center"/>
+            </w:pPr>
+            <w:r>
+              <w:rPr>
+                <w:rFonts w:ascii="Arial" w:hAnsi="Arial"/>
+                <w:b/>
+                <w:color w:val="FFFFFF"/>
+                <w:sz w:val="20"/>
+              </w:rPr>
+              <w:t>Sistema / Fonte</w:t>
+            </w:r>
+          </w:p>
+        </w:tc>
+        <w:tc>
+          <w:tcPr>
+            <w:tcW w:type="dxa" w:w="6236"/>
+            <w:shd w:val="clear" w:color="auto" w:fill="00205B"/>
+          </w:tcPr>
+          <w:p>
+            <w:pPr>
+              <w:jc w:val="center"/>
+            </w:pPr>
+            <w:r>
+              <w:rPr>
+                <w:rFonts w:ascii="Arial" w:hAnsi="Arial"/>
+                <w:b/>
+                <w:color w:val="FFFFFF"/>
+                <w:sz w:val="20"/>
+              </w:rPr>
+              <w:t>Informação disponível</w:t>
+            </w:r>
+          </w:p>
+        </w:tc>
+      </w:tr>
+      <w:tr>
+        <w:tc>
+          <w:tcPr>
+            <w:tcW w:type="dxa" w:w="3402"/>
+            <w:shd w:val="clear" w:color="auto" w:fill="F2F2F2"/>
+          </w:tcPr>
+          <w:p>
+            <w:pPr>
+              <w:jc w:val="left"/>
+            </w:pPr>
+            <w:r>
+              <w:rPr>
+                <w:rFonts w:ascii="Arial" w:hAnsi="Arial"/>
+                <w:sz w:val="20"/>
+              </w:rPr>
+              <w:t>ECF (Escrituração Contábil Fiscal)</w:t>
+            </w:r>
+          </w:p>
+        </w:tc>
+        <w:tc>
+          <w:tcPr>
+            <w:tcW w:type="dxa" w:w="6236"/>
+            <w:shd w:val="clear" w:color="auto" w:fill="F2F2F2"/>
+          </w:tcPr>
+          <w:p>
+            <w:pPr>
+              <w:jc w:val="center"/>
+            </w:pPr>
+            <w:r>
+              <w:rPr>
+                <w:rFonts w:ascii="Arial" w:hAnsi="Arial"/>
+                <w:sz w:val="20"/>
+              </w:rPr>
+              <w:t>Principal fonte para Lucro Real/Presumido — DRE e Balanço</w:t>
+            </w:r>
+          </w:p>
+        </w:tc>
+      </w:tr>
+      <w:tr>
+        <w:tc>
+          <w:tcPr>
+            <w:tcW w:type="dxa" w:w="3402"/>
+            <w:shd w:val="clear" w:color="auto" w:fill="FFFFFF"/>
+          </w:tcPr>
+          <w:p>
+            <w:pPr>
+              <w:jc w:val="left"/>
+            </w:pPr>
+            <w:r>
+              <w:rPr>
+                <w:rFonts w:ascii="Arial" w:hAnsi="Arial"/>
+                <w:sz w:val="20"/>
+              </w:rPr>
+              <w:t>DIRF / DCTF</w:t>
+            </w:r>
+          </w:p>
+        </w:tc>
+        <w:tc>
+          <w:tcPr>
+            <w:tcW w:type="dxa" w:w="6236"/>
+            <w:shd w:val="clear" w:color="auto" w:fill="FFFFFF"/>
+          </w:tcPr>
+          <w:p>
+            <w:pPr>
+              <w:jc w:val="center"/>
+            </w:pPr>
+            <w:r>
+              <w:rPr>
+                <w:rFonts w:ascii="Arial" w:hAnsi="Arial"/>
+                <w:sz w:val="20"/>
+              </w:rPr>
+              <w:t>Cruzamento de rendimentos e declarações</w:t>
+            </w:r>
+          </w:p>
+        </w:tc>
+      </w:tr>
+      <w:tr>
+        <w:tc>
+          <w:tcPr>
+            <w:tcW w:type="dxa" w:w="3402"/>
+            <w:shd w:val="clear" w:color="auto" w:fill="F2F2F2"/>
+          </w:tcPr>
+          <w:p>
+            <w:pPr>
+              <w:jc w:val="left"/>
+            </w:pPr>
+            <w:r>
+              <w:rPr>
+                <w:rFonts w:ascii="Arial" w:hAnsi="Arial"/>
+                <w:sz w:val="20"/>
+              </w:rPr>
+              <w:t>SPED</w:t>
+            </w:r>
+          </w:p>
+        </w:tc>
+        <w:tc>
+          <w:tcPr>
+            <w:tcW w:type="dxa" w:w="6236"/>
+            <w:shd w:val="clear" w:color="auto" w:fill="F2F2F2"/>
+          </w:tcPr>
+          <w:p>
+            <w:pPr>
+              <w:jc w:val="center"/>
+            </w:pPr>
+            <w:r>
+              <w:rPr>
+                <w:rFonts w:ascii="Arial" w:hAnsi="Arial"/>
+                <w:sz w:val="20"/>
+              </w:rPr>
+              <w:t>Escrituração contábil e fiscal digital</w:t>
+            </w:r>
+          </w:p>
+        </w:tc>
+      </w:tr>
+      <w:tr>
+        <w:tc>
+          <w:tcPr>
+            <w:tcW w:type="dxa" w:w="3402"/>
+            <w:shd w:val="clear" w:color="auto" w:fill="FFFFFF"/>
+          </w:tcPr>
+          <w:p>
+            <w:pPr>
+              <w:jc w:val="left"/>
+            </w:pPr>
+            <w:r>
+              <w:rPr>
+                <w:rFonts w:ascii="Arial" w:hAnsi="Arial"/>
+                <w:sz w:val="20"/>
+              </w:rPr>
+              <w:t>DAS / PGDAS</w:t>
+            </w:r>
+          </w:p>
+        </w:tc>
+        <w:tc>
+          <w:tcPr>
+            <w:tcW w:type="dxa" w:w="6236"/>
+            <w:shd w:val="clear" w:color="auto" w:fill="FFFFFF"/>
+          </w:tcPr>
+          <w:p>
+            <w:pPr>
+              <w:jc w:val="center"/>
+            </w:pPr>
+            <w:r>
+              <w:rPr>
+                <w:rFonts w:ascii="Arial" w:hAnsi="Arial"/>
+                <w:sz w:val="20"/>
+              </w:rPr>
+              <w:t>Faturamento para optantes do Simples Nacional</w:t>
+            </w:r>
+          </w:p>
+        </w:tc>
+      </w:tr>
+      <w:tr>
+        <w:tc>
+          <w:tcPr>
+            <w:tcW w:type="dxa" w:w="3402"/>
+            <w:shd w:val="clear" w:color="auto" w:fill="F2F2F2"/>
+          </w:tcPr>
+          <w:p>
+            <w:pPr>
+              <w:jc w:val="left"/>
+            </w:pPr>
+            <w:r>
+              <w:rPr>
+                <w:rFonts w:ascii="Arial" w:hAnsi="Arial"/>
+                <w:sz w:val="20"/>
+              </w:rPr>
+              <w:t>NF-e / NFS-e</w:t>
+            </w:r>
+          </w:p>
+        </w:tc>
+        <w:tc>
+          <w:tcPr>
+            <w:tcW w:type="dxa" w:w="6236"/>
+            <w:shd w:val="clear" w:color="auto" w:fill="F2F2F2"/>
+          </w:tcPr>
+          <w:p>
+            <w:pPr>
+              <w:jc w:val="center"/>
+            </w:pPr>
+            <w:r>
+              <w:rPr>
+                <w:rFonts w:ascii="Arial" w:hAnsi="Arial"/>
+                <w:sz w:val="20"/>
+              </w:rPr>
+              <w:t>Notas fiscais emitidas — úteis para estimativa</w:t>
+            </w:r>
+          </w:p>
+        </w:tc>
+      </w:tr>
+    </w:tbl>
+    <w:p/>
+    <w:tbl>
+      <w:tblPr>
+        <w:tblStyle w:val="TableGrid"/>
+        <w:tblW w:type="auto" w:w="0"/>
+        <w:tblLook w:firstColumn="1" w:firstRow="1" w:lastColumn="0" w:lastRow="0" w:noHBand="0" w:noVBand="1" w:val="04A0"/>
+      </w:tblPr>
+      <w:tblGrid>
+        <w:gridCol w:w="9405"/>
+      </w:tblGrid>
+      <w:tr>
+        <w:tc>
+          <w:tcPr>
+            <w:tcW w:type="dxa" w:w="9405"/>
+            <w:shd w:val="clear" w:color="auto" w:fill="F2F2F2"/>
+            <w:tcBorders>
+              <w:bottom w:val="single" w:sz="6" w:space="0" w:color="64A70B"/>
+            </w:tcBorders>
+          </w:tcPr>
+          <w:p>
+            <w:r>
+              <w:rPr>
+                <w:rFonts w:ascii="Arial" w:hAnsi="Arial"/>
+                <w:color w:val="444400"/>
+                <w:sz w:val="20"/>
+              </w:rPr>
+              <w:t>⚠  A ausência de defesa não impede a dosimetria nem desobriga o operador de buscar exaustivamente os dados antes de recorrer à estimativa.</w:t>
+            </w:r>
+          </w:p>
+        </w:tc>
+      </w:tr>
+    </w:tbl>
+    <w:p/>
+    <w:p>
+      <w:pPr>
+        <w:spacing w:before="240" w:after="80"/>
+        <w:pBdr>
+          <w:bottom w:val="single" w:sz="6" w:space="1" w:color="64A70B"/>
+        </w:pBdr>
+      </w:pPr>
+      <w:r>
+        <w:rPr>
+          <w:rFonts w:ascii="Arial" w:hAnsi="Arial"/>
+          <w:b/>
+          <w:color w:val="1D3A78"/>
+          <w:sz w:val="23"/>
+        </w:rPr>
+        <w:t>13.2 Piso Absoluto de R$ 6.000,00 (Empresa Fantasma ou Noteira)</w:t>
+      </w:r>
+    </w:p>
+    <w:p>
+      <w:pPr>
+        <w:spacing w:before="0" w:after="80"/>
+      </w:pPr>
+      <w:r>
+        <w:rPr>
+          <w:rFonts w:ascii="Arial" w:hAnsi="Arial"/>
+          <w:i w:val="0"/>
+          <w:sz w:val="22"/>
+        </w:rPr>
+        <w:t>Quando a PJ é uma empresa-fantasma sem faturamento rastreável e a alíquota resultante é zero ou ínfima, aplica-se o piso absoluto de R$ 6.000,00 (Art. 20, §4º da Lei nº 12.846/2013). A multa final não pode ser inferior a esse valor.</w:t>
+      </w:r>
+    </w:p>
+    <w:tbl>
+      <w:tblPr>
+        <w:tblStyle w:val="TableGrid"/>
+        <w:tblW w:type="auto" w:w="0"/>
+        <w:jc w:val="left"/>
+        <w:tblLook w:firstColumn="1" w:firstRow="1" w:lastColumn="0" w:lastRow="0" w:noHBand="0" w:noVBand="1" w:val="04A0"/>
+      </w:tblPr>
+      <w:tblGrid>
+        <w:gridCol w:w="4702"/>
+        <w:gridCol w:w="4702"/>
+      </w:tblGrid>
+      <w:tr>
+        <w:tc>
+          <w:tcPr>
+            <w:tcW w:type="dxa" w:w="5669"/>
+            <w:shd w:val="clear" w:color="auto" w:fill="00205B"/>
+          </w:tcPr>
+          <w:p>
+            <w:pPr>
+              <w:jc w:val="center"/>
+            </w:pPr>
+            <w:r>
+              <w:rPr>
+                <w:rFonts w:ascii="Arial" w:hAnsi="Arial"/>
+                <w:b/>
+                <w:color w:val="FFFFFF"/>
+                <w:sz w:val="20"/>
+              </w:rPr>
+              <w:t>Situação</w:t>
+            </w:r>
+          </w:p>
+        </w:tc>
+        <w:tc>
+          <w:tcPr>
+            <w:tcW w:type="dxa" w:w="3969"/>
+            <w:shd w:val="clear" w:color="auto" w:fill="00205B"/>
+          </w:tcPr>
+          <w:p>
+            <w:pPr>
+              <w:jc w:val="center"/>
+            </w:pPr>
+            <w:r>
+              <w:rPr>
+                <w:rFonts w:ascii="Arial" w:hAnsi="Arial"/>
+                <w:b/>
+                <w:color w:val="FFFFFF"/>
+                <w:sz w:val="20"/>
+              </w:rPr>
+              <w:t>Multa Final</w:t>
+            </w:r>
+          </w:p>
+        </w:tc>
+      </w:tr>
+      <w:tr>
+        <w:tc>
+          <w:tcPr>
+            <w:tcW w:type="dxa" w:w="5669"/>
+            <w:shd w:val="clear" w:color="auto" w:fill="F2F2F2"/>
+          </w:tcPr>
+          <w:p>
+            <w:pPr>
+              <w:jc w:val="left"/>
+            </w:pPr>
+            <w:r>
+              <w:rPr>
+                <w:rFonts w:ascii="Arial" w:hAnsi="Arial"/>
+                <w:sz w:val="20"/>
+              </w:rPr>
+              <w:t>Alíquota zero por excesso de atenuantes</w:t>
+            </w:r>
+          </w:p>
+        </w:tc>
+        <w:tc>
+          <w:tcPr>
+            <w:tcW w:type="dxa" w:w="3969"/>
+            <w:shd w:val="clear" w:color="auto" w:fill="F2F2F2"/>
+          </w:tcPr>
+          <w:p>
+            <w:pPr>
+              <w:jc w:val="center"/>
+            </w:pPr>
+            <w:r>
+              <w:rPr>
+                <w:rFonts w:ascii="Arial" w:hAnsi="Arial"/>
+                <w:sz w:val="20"/>
+              </w:rPr>
+              <w:t>R$ 6.000,00 (piso absoluto)</w:t>
+            </w:r>
+          </w:p>
+        </w:tc>
+      </w:tr>
+      <w:tr>
+        <w:tc>
+          <w:tcPr>
+            <w:tcW w:type="dxa" w:w="5669"/>
+            <w:shd w:val="clear" w:color="auto" w:fill="FFFFFF"/>
+          </w:tcPr>
+          <w:p>
+            <w:pPr>
+              <w:jc w:val="left"/>
+            </w:pPr>
+            <w:r>
+              <w:rPr>
+                <w:rFonts w:ascii="Arial" w:hAnsi="Arial"/>
+                <w:sz w:val="20"/>
+              </w:rPr>
+              <w:t>Faturamento ínfimo + alíquota baixa → resultado &lt; R$ 6k</w:t>
+            </w:r>
+          </w:p>
+        </w:tc>
+        <w:tc>
+          <w:tcPr>
+            <w:tcW w:type="dxa" w:w="3969"/>
+            <w:shd w:val="clear" w:color="auto" w:fill="FFFFFF"/>
+          </w:tcPr>
+          <w:p>
+            <w:pPr>
+              <w:jc w:val="center"/>
+            </w:pPr>
+            <w:r>
+              <w:rPr>
+                <w:rFonts w:ascii="Arial" w:hAnsi="Arial"/>
+                <w:sz w:val="20"/>
+              </w:rPr>
+              <w:t>R$ 6.000,00 (piso absoluto)</w:t>
+            </w:r>
+          </w:p>
+        </w:tc>
+      </w:tr>
+    </w:tbl>
+    <w:p/>
+    <w:p>
+      <w:pPr>
+        <w:spacing w:before="240" w:after="80"/>
+        <w:pBdr>
+          <w:bottom w:val="single" w:sz="6" w:space="1" w:color="64A70B"/>
+        </w:pBdr>
+      </w:pPr>
+      <w:r>
+        <w:rPr>
+          <w:rFonts w:ascii="Arial" w:hAnsi="Arial"/>
+          <w:b/>
+          <w:color w:val="1D3A78"/>
+          <w:sz w:val="23"/>
+        </w:rPr>
+        <w:t>13.3 Estimativa Fundamentada (Art. 20, §1º, III)</w:t>
+      </w:r>
+    </w:p>
+    <w:p>
+      <w:pPr>
+        <w:spacing w:before="0" w:after="80"/>
+      </w:pPr>
+      <w:r>
+        <w:rPr>
+          <w:rFonts w:ascii="Arial" w:hAnsi="Arial"/>
+          <w:i w:val="0"/>
+          <w:sz w:val="22"/>
+        </w:rPr>
+        <w:t>Quando não há faturamento histórico em nenhum sistema, a autoridade realiza estimativa técnica com base em elementos objetivos. O procedimento é:</w:t>
+      </w:r>
+    </w:p>
+    <w:p>
+      <w:pPr>
+        <w:pStyle w:val="ListBullet"/>
+        <w:spacing w:before="0" w:after="40"/>
+        <w:ind w:left="283"/>
+      </w:pPr>
+      <w:r>
+        <w:rPr>
+          <w:rFonts w:ascii="Arial" w:hAnsi="Arial"/>
+          <w:sz w:val="22"/>
+        </w:rPr>
+        <w:t>1. Levantar o capital social ou outros indicadores objetivos (GFIP, compras, valor de repasses ilícitos);</w:t>
+      </w:r>
+    </w:p>
+    <w:p>
+      <w:pPr>
+        <w:pStyle w:val="ListBullet"/>
+        <w:spacing w:before="0" w:after="40"/>
+        <w:ind w:left="283"/>
+      </w:pPr>
+      <w:r>
+        <w:rPr>
+          <w:rFonts w:ascii="Arial" w:hAnsi="Arial"/>
+          <w:sz w:val="22"/>
+        </w:rPr>
+        <w:t>2. Identificar o CNAE e a carga tributária estimada do regime vigente;</w:t>
+      </w:r>
+    </w:p>
+    <w:p>
+      <w:pPr>
+        <w:pStyle w:val="ListBullet"/>
+        <w:spacing w:before="0" w:after="40"/>
+        <w:ind w:left="283"/>
+      </w:pPr>
+      <w:r>
+        <w:rPr>
+          <w:rFonts w:ascii="Arial" w:hAnsi="Arial"/>
+          <w:sz w:val="22"/>
+        </w:rPr>
+        <w:t>3. Base histórica líquida = indicador bruto − tributos estimados;</w:t>
+      </w:r>
+    </w:p>
+    <w:p>
+      <w:pPr>
+        <w:pStyle w:val="ListBullet"/>
+        <w:spacing w:before="0" w:after="40"/>
+        <w:ind w:left="283"/>
+      </w:pPr>
+      <w:r>
+        <w:rPr>
+          <w:rFonts w:ascii="Arial" w:hAnsi="Arial"/>
+          <w:sz w:val="22"/>
+        </w:rPr>
+        <w:t>4. Atualizar pelo IPCA até 31/12 do exercício anterior ao PAR.</w:t>
+      </w:r>
+    </w:p>
+    <w:tbl>
+      <w:tblPr>
+        <w:tblStyle w:val="TableGrid"/>
+        <w:tblW w:type="auto" w:w="0"/>
+        <w:tblLook w:firstColumn="1" w:firstRow="1" w:lastColumn="0" w:lastRow="0" w:noHBand="0" w:noVBand="1" w:val="04A0"/>
+      </w:tblPr>
+      <w:tblGrid>
+        <w:gridCol w:w="9405"/>
+      </w:tblGrid>
+      <w:tr>
+        <w:tc>
+          <w:tcPr>
+            <w:tcW w:type="dxa" w:w="9405"/>
+            <w:shd w:val="clear" w:color="auto" w:fill="F2F2F2"/>
+            <w:tcBorders>
+              <w:bottom w:val="single" w:sz="6" w:space="0" w:color="64A70B"/>
+            </w:tcBorders>
+          </w:tcPr>
+          <w:p>
+            <w:r>
+              <w:rPr>
+                <w:rFonts w:ascii="Arial" w:hAnsi="Arial"/>
+                <w:color w:val="444400"/>
+                <w:sz w:val="20"/>
+              </w:rPr>
+              <w:t>⚠  Estimativa técnica não é valor arbitrário. Deve ser formalmente fundamentada com os elementos usados. A autoridade documenta cada premissa no processo.</w:t>
+            </w:r>
+          </w:p>
+        </w:tc>
+      </w:tr>
+    </w:tbl>
+    <w:p/>
+    <w:p>
+      <w:pPr>
+        <w:spacing w:before="240" w:after="80"/>
+        <w:pBdr>
+          <w:bottom w:val="single" w:sz="6" w:space="1" w:color="64A70B"/>
+        </w:pBdr>
+      </w:pPr>
+      <w:r>
+        <w:rPr>
+          <w:rFonts w:ascii="Arial" w:hAnsi="Arial"/>
+          <w:b/>
+          <w:color w:val="1D3A78"/>
+          <w:sz w:val="23"/>
+        </w:rPr>
+        <w:t>13.4 Retroação Anual — Art. 21 (Sem Faturamento no Exercício Anterior)</w:t>
+      </w:r>
+    </w:p>
+    <w:p>
+      <w:pPr>
+        <w:spacing w:before="0" w:after="80"/>
+      </w:pPr>
+      <w:r>
+        <w:rPr>
+          <w:rFonts w:ascii="Arial" w:hAnsi="Arial"/>
+          <w:i w:val="0"/>
+          <w:sz w:val="22"/>
+        </w:rPr>
+        <w:t>Quando a PJ não teve faturamento no exercício imediatamente anterior ao PAR, recua-se ano a ano até encontrar um período com faturamento válido, e atualiza-se pelo IPCA:</w:t>
+      </w:r>
+    </w:p>
+    <w:tbl>
+      <w:tblPr>
+        <w:tblStyle w:val="TableGrid"/>
+        <w:tblW w:type="auto" w:w="0"/>
+        <w:jc w:val="left"/>
+        <w:tblLook w:firstColumn="1" w:firstRow="1" w:lastColumn="0" w:lastRow="0" w:noHBand="0" w:noVBand="1" w:val="04A0"/>
+      </w:tblPr>
+      <w:tblGrid>
+        <w:gridCol w:w="3135"/>
+        <w:gridCol w:w="3135"/>
+        <w:gridCol w:w="3135"/>
+      </w:tblGrid>
+      <w:tr>
+        <w:tc>
+          <w:tcPr>
+            <w:tcW w:type="dxa" w:w="2835"/>
+            <w:shd w:val="clear" w:color="auto" w:fill="00205B"/>
+          </w:tcPr>
+          <w:p>
+            <w:pPr>
+              <w:jc w:val="center"/>
+            </w:pPr>
+            <w:r>
+              <w:rPr>
+                <w:rFonts w:ascii="Arial" w:hAnsi="Arial"/>
+                <w:b/>
+                <w:color w:val="FFFFFF"/>
+                <w:sz w:val="20"/>
+              </w:rPr>
+              <w:t>Exercício</w:t>
+            </w:r>
+          </w:p>
+        </w:tc>
+        <w:tc>
+          <w:tcPr>
+            <w:tcW w:type="dxa" w:w="2835"/>
+            <w:shd w:val="clear" w:color="auto" w:fill="00205B"/>
+          </w:tcPr>
+          <w:p>
+            <w:pPr>
+              <w:jc w:val="center"/>
+            </w:pPr>
+            <w:r>
+              <w:rPr>
+                <w:rFonts w:ascii="Arial" w:hAnsi="Arial"/>
+                <w:b/>
+                <w:color w:val="FFFFFF"/>
+                <w:sz w:val="20"/>
+              </w:rPr>
+              <w:t>Faturamento Bruto</w:t>
+            </w:r>
+          </w:p>
+        </w:tc>
+        <w:tc>
+          <w:tcPr>
+            <w:tcW w:type="dxa" w:w="3969"/>
+            <w:shd w:val="clear" w:color="auto" w:fill="00205B"/>
+          </w:tcPr>
+          <w:p>
+            <w:pPr>
+              <w:jc w:val="center"/>
+            </w:pPr>
+            <w:r>
+              <w:rPr>
+                <w:rFonts w:ascii="Arial" w:hAnsi="Arial"/>
+                <w:b/>
+                <w:color w:val="FFFFFF"/>
+                <w:sz w:val="20"/>
+              </w:rPr>
+              <w:t>Situação</w:t>
+            </w:r>
+          </w:p>
+        </w:tc>
+      </w:tr>
+      <w:tr>
+        <w:tc>
+          <w:tcPr>
+            <w:tcW w:type="dxa" w:w="2835"/>
+            <w:shd w:val="clear" w:color="auto" w:fill="F2F2F2"/>
+          </w:tcPr>
+          <w:p>
+            <w:pPr>
+              <w:jc w:val="left"/>
+            </w:pPr>
+            <w:r>
+              <w:rPr>
+                <w:rFonts w:ascii="Arial" w:hAnsi="Arial"/>
+                <w:sz w:val="20"/>
+              </w:rPr>
+              <w:t>Exercício PAR − 1</w:t>
+            </w:r>
+          </w:p>
+        </w:tc>
+        <w:tc>
+          <w:tcPr>
+            <w:tcW w:type="dxa" w:w="2835"/>
+            <w:shd w:val="clear" w:color="auto" w:fill="F2F2F2"/>
+          </w:tcPr>
+          <w:p>
+            <w:pPr>
+              <w:jc w:val="center"/>
+            </w:pPr>
+            <w:r>
+              <w:rPr>
+                <w:rFonts w:ascii="Arial" w:hAnsi="Arial"/>
+                <w:sz w:val="20"/>
+              </w:rPr>
+              <w:t>R$ 0,00</w:t>
+            </w:r>
+          </w:p>
+        </w:tc>
+        <w:tc>
+          <w:tcPr>
+            <w:tcW w:type="dxa" w:w="3969"/>
+            <w:shd w:val="clear" w:color="auto" w:fill="F2F2F2"/>
+          </w:tcPr>
+          <w:p>
+            <w:pPr>
+              <w:jc w:val="center"/>
+            </w:pPr>
+            <w:r>
+              <w:rPr>
+                <w:rFonts w:ascii="Arial" w:hAnsi="Arial"/>
+                <w:sz w:val="20"/>
+              </w:rPr>
+              <w:t>Sem faturamento — retroage</w:t>
+            </w:r>
+          </w:p>
+        </w:tc>
+      </w:tr>
+      <w:tr>
+        <w:tc>
+          <w:tcPr>
+            <w:tcW w:type="dxa" w:w="2835"/>
+            <w:shd w:val="clear" w:color="auto" w:fill="FFFFFF"/>
+          </w:tcPr>
+          <w:p>
+            <w:pPr>
+              <w:jc w:val="left"/>
+            </w:pPr>
+            <w:r>
+              <w:rPr>
+                <w:rFonts w:ascii="Arial" w:hAnsi="Arial"/>
+                <w:sz w:val="20"/>
+              </w:rPr>
+              <w:t>Exercício PAR − 2</w:t>
+            </w:r>
+          </w:p>
+        </w:tc>
+        <w:tc>
+          <w:tcPr>
+            <w:tcW w:type="dxa" w:w="2835"/>
+            <w:shd w:val="clear" w:color="auto" w:fill="FFFFFF"/>
+          </w:tcPr>
+          <w:p>
+            <w:pPr>
+              <w:jc w:val="center"/>
+            </w:pPr>
+            <w:r>
+              <w:rPr>
+                <w:rFonts w:ascii="Arial" w:hAnsi="Arial"/>
+                <w:sz w:val="20"/>
+              </w:rPr>
+              <w:t>R$ 0,00</w:t>
+            </w:r>
+          </w:p>
+        </w:tc>
+        <w:tc>
+          <w:tcPr>
+            <w:tcW w:type="dxa" w:w="3969"/>
+            <w:shd w:val="clear" w:color="auto" w:fill="FFFFFF"/>
+          </w:tcPr>
+          <w:p>
+            <w:pPr>
+              <w:jc w:val="center"/>
+            </w:pPr>
+            <w:r>
+              <w:rPr>
+                <w:rFonts w:ascii="Arial" w:hAnsi="Arial"/>
+                <w:sz w:val="20"/>
+              </w:rPr>
+              <w:t>Sem faturamento — retroage</w:t>
+            </w:r>
+          </w:p>
+        </w:tc>
+      </w:tr>
+      <w:tr>
+        <w:tc>
+          <w:tcPr>
+            <w:tcW w:type="dxa" w:w="2835"/>
+            <w:shd w:val="clear" w:color="auto" w:fill="F2F2F2"/>
+          </w:tcPr>
+          <w:p>
+            <w:pPr>
+              <w:jc w:val="left"/>
+            </w:pPr>
+            <w:r>
+              <w:rPr>
+                <w:rFonts w:ascii="Arial" w:hAnsi="Arial"/>
+                <w:sz w:val="20"/>
+              </w:rPr>
+              <w:t>Exercício PAR − N</w:t>
+            </w:r>
+          </w:p>
+        </w:tc>
+        <w:tc>
+          <w:tcPr>
+            <w:tcW w:type="dxa" w:w="2835"/>
+            <w:shd w:val="clear" w:color="auto" w:fill="F2F2F2"/>
+          </w:tcPr>
+          <w:p>
+            <w:pPr>
+              <w:jc w:val="center"/>
+            </w:pPr>
+            <w:r>
+              <w:rPr>
+                <w:rFonts w:ascii="Arial" w:hAnsi="Arial"/>
+                <w:sz w:val="20"/>
+              </w:rPr>
+              <w:t>Valor encontrado</w:t>
+            </w:r>
+          </w:p>
+        </w:tc>
+        <w:tc>
+          <w:tcPr>
+            <w:tcW w:type="dxa" w:w="3969"/>
+            <w:shd w:val="clear" w:color="auto" w:fill="F2F2F2"/>
+          </w:tcPr>
+          <w:p>
+            <w:pPr>
+              <w:jc w:val="center"/>
+            </w:pPr>
+            <w:r>
+              <w:rPr>
+                <w:rFonts w:ascii="Arial" w:hAnsi="Arial"/>
+                <w:sz w:val="20"/>
+              </w:rPr>
+              <w:t>Base histórica → aplicar IPCA</w:t>
+            </w:r>
+          </w:p>
+        </w:tc>
+      </w:tr>
+    </w:tbl>
+    <w:p/>
+    <w:p>
+      <w:pPr>
+        <w:spacing w:before="0" w:after="80"/>
+      </w:pPr>
+      <w:r>
+        <w:rPr>
+          <w:rFonts w:ascii="Arial" w:hAnsi="Arial"/>
+          <w:i w:val="0"/>
+          <w:sz w:val="22"/>
+        </w:rPr>
+        <w:t>O valor corrigido pelo IPCA passa a ser a base de cálculo oficial para toda a dosimetria.</w:t>
+      </w:r>
+    </w:p>
+    <w:p>
+      <w:pPr>
+        <w:spacing w:before="240" w:after="80"/>
+        <w:pBdr>
+          <w:bottom w:val="single" w:sz="6" w:space="1" w:color="64A70B"/>
+        </w:pBdr>
+      </w:pPr>
+      <w:r>
+        <w:rPr>
+          <w:rFonts w:ascii="Arial" w:hAnsi="Arial"/>
+          <w:b/>
+          <w:color w:val="1D3A78"/>
+          <w:sz w:val="23"/>
+        </w:rPr>
+        <w:t>13.5 Sucessão Empresarial (Art. 4º, Lei nº 12.846/2013)</w:t>
+      </w:r>
+    </w:p>
+    <w:tbl>
+      <w:tblPr>
+        <w:tblStyle w:val="TableGrid"/>
+        <w:tblW w:type="auto" w:w="0"/>
+        <w:jc w:val="left"/>
+        <w:tblLook w:firstColumn="1" w:firstRow="1" w:lastColumn="0" w:lastRow="0" w:noHBand="0" w:noVBand="1" w:val="04A0"/>
+      </w:tblPr>
+      <w:tblGrid>
+        <w:gridCol w:w="3135"/>
+        <w:gridCol w:w="3135"/>
+        <w:gridCol w:w="3135"/>
+      </w:tblGrid>
+      <w:tr>
+        <w:tc>
+          <w:tcPr>
+            <w:tcW w:type="dxa" w:w="3118"/>
+            <w:shd w:val="clear" w:color="auto" w:fill="00205B"/>
+          </w:tcPr>
+          <w:p>
+            <w:pPr>
+              <w:jc w:val="center"/>
+            </w:pPr>
+            <w:r>
+              <w:rPr>
+                <w:rFonts w:ascii="Arial" w:hAnsi="Arial"/>
+                <w:b/>
+                <w:color w:val="FFFFFF"/>
+                <w:sz w:val="20"/>
+              </w:rPr>
+              <w:t>Evento Societário</w:t>
+            </w:r>
+          </w:p>
+        </w:tc>
+        <w:tc>
+          <w:tcPr>
+            <w:tcW w:type="dxa" w:w="3402"/>
+            <w:shd w:val="clear" w:color="auto" w:fill="00205B"/>
+          </w:tcPr>
+          <w:p>
+            <w:pPr>
+              <w:jc w:val="center"/>
+            </w:pPr>
+            <w:r>
+              <w:rPr>
+                <w:rFonts w:ascii="Arial" w:hAnsi="Arial"/>
+                <w:b/>
+                <w:color w:val="FFFFFF"/>
+                <w:sz w:val="20"/>
+              </w:rPr>
+              <w:t>Responsabilidade da Sucessora</w:t>
+            </w:r>
+          </w:p>
+        </w:tc>
+        <w:tc>
+          <w:tcPr>
+            <w:tcW w:type="dxa" w:w="3118"/>
+            <w:shd w:val="clear" w:color="auto" w:fill="00205B"/>
+          </w:tcPr>
+          <w:p>
+            <w:pPr>
+              <w:jc w:val="center"/>
+            </w:pPr>
+            <w:r>
+              <w:rPr>
+                <w:rFonts w:ascii="Arial" w:hAnsi="Arial"/>
+                <w:b/>
+                <w:color w:val="FFFFFF"/>
+                <w:sz w:val="20"/>
+              </w:rPr>
+              <w:t>Base de Cálculo</w:t>
+            </w:r>
+          </w:p>
+        </w:tc>
+      </w:tr>
+      <w:tr>
+        <w:tc>
+          <w:tcPr>
+            <w:tcW w:type="dxa" w:w="3118"/>
+            <w:shd w:val="clear" w:color="auto" w:fill="F2F2F2"/>
+          </w:tcPr>
+          <w:p>
+            <w:pPr>
+              <w:jc w:val="left"/>
+            </w:pPr>
+            <w:r>
+              <w:rPr>
+                <w:rFonts w:ascii="Arial" w:hAnsi="Arial"/>
+                <w:sz w:val="20"/>
+              </w:rPr>
+              <w:t>Alteração contratual ou transformação</w:t>
+            </w:r>
+          </w:p>
+        </w:tc>
+        <w:tc>
+          <w:tcPr>
+            <w:tcW w:type="dxa" w:w="3402"/>
+            <w:shd w:val="clear" w:color="auto" w:fill="F2F2F2"/>
+          </w:tcPr>
+          <w:p>
+            <w:pPr>
+              <w:jc w:val="center"/>
+            </w:pPr>
+            <w:r>
+              <w:rPr>
+                <w:rFonts w:ascii="Arial" w:hAnsi="Arial"/>
+                <w:sz w:val="20"/>
+              </w:rPr>
+              <w:t>Mesma PJ — responsabilidade inalterada</w:t>
+            </w:r>
+          </w:p>
+        </w:tc>
+        <w:tc>
+          <w:tcPr>
+            <w:tcW w:type="dxa" w:w="3118"/>
+            <w:shd w:val="clear" w:color="auto" w:fill="F2F2F2"/>
+          </w:tcPr>
+          <w:p>
+            <w:pPr>
+              <w:jc w:val="center"/>
+            </w:pPr>
+            <w:r>
+              <w:rPr>
+                <w:rFonts w:ascii="Arial" w:hAnsi="Arial"/>
+                <w:sz w:val="20"/>
+              </w:rPr>
+              <w:t>Faturamento da própria PJ</w:t>
+            </w:r>
+          </w:p>
+        </w:tc>
+      </w:tr>
+      <w:tr>
+        <w:tc>
+          <w:tcPr>
+            <w:tcW w:type="dxa" w:w="3118"/>
+            <w:shd w:val="clear" w:color="auto" w:fill="FFFFFF"/>
+          </w:tcPr>
+          <w:p>
+            <w:pPr>
+              <w:jc w:val="left"/>
+            </w:pPr>
+            <w:r>
+              <w:rPr>
+                <w:rFonts w:ascii="Arial" w:hAnsi="Arial"/>
+                <w:sz w:val="20"/>
+              </w:rPr>
+              <w:t>Incorporação ou fusão</w:t>
+            </w:r>
+          </w:p>
+        </w:tc>
+        <w:tc>
+          <w:tcPr>
+            <w:tcW w:type="dxa" w:w="3402"/>
+            <w:shd w:val="clear" w:color="auto" w:fill="FFFFFF"/>
+          </w:tcPr>
+          <w:p>
+            <w:pPr>
+              <w:jc w:val="center"/>
+            </w:pPr>
+            <w:r>
+              <w:rPr>
+                <w:rFonts w:ascii="Arial" w:hAnsi="Arial"/>
+                <w:sz w:val="20"/>
+              </w:rPr>
+              <w:t>Sucessora responde, limitada ao patrimônio transferido</w:t>
+            </w:r>
+          </w:p>
+        </w:tc>
+        <w:tc>
+          <w:tcPr>
+            <w:tcW w:type="dxa" w:w="3118"/>
+            <w:shd w:val="clear" w:color="auto" w:fill="FFFFFF"/>
+          </w:tcPr>
+          <w:p>
+            <w:pPr>
+              <w:jc w:val="center"/>
+            </w:pPr>
+            <w:r>
+              <w:rPr>
+                <w:rFonts w:ascii="Arial" w:hAnsi="Arial"/>
+                <w:sz w:val="20"/>
+              </w:rPr>
+              <w:t>Faturamento da empresa SUCESSORA</w:t>
+            </w:r>
+          </w:p>
+        </w:tc>
+      </w:tr>
+    </w:tbl>
+    <w:p/>
+    <w:tbl>
+      <w:tblPr>
+        <w:tblStyle w:val="TableGrid"/>
+        <w:tblW w:type="auto" w:w="0"/>
+        <w:tblLook w:firstColumn="1" w:firstRow="1" w:lastColumn="0" w:lastRow="0" w:noHBand="0" w:noVBand="1" w:val="04A0"/>
+      </w:tblPr>
+      <w:tblGrid>
+        <w:gridCol w:w="9405"/>
+      </w:tblGrid>
+      <w:tr>
+        <w:tc>
+          <w:tcPr>
+            <w:tcW w:type="dxa" w:w="9405"/>
+            <w:shd w:val="clear" w:color="auto" w:fill="F2F2F2"/>
+            <w:tcBorders>
+              <w:bottom w:val="single" w:sz="6" w:space="0" w:color="64A70B"/>
+            </w:tcBorders>
+          </w:tcPr>
+          <w:p>
+            <w:r>
+              <w:rPr>
+                <w:rFonts w:ascii="Arial" w:hAnsi="Arial"/>
+                <w:color w:val="444400"/>
+                <w:sz w:val="20"/>
+              </w:rPr>
+              <w:t>⚠  Se o evento sucessório ocorrer durante o andamento do PAR, o polo passivo é redirecionado na Nota de Indiciação para a empresa sucessora.</w:t>
+            </w:r>
+          </w:p>
+        </w:tc>
+      </w:tr>
+    </w:tbl>
+    <w:p/>
+    <w:p>
+      <w:pPr>
+        <w:spacing w:before="240" w:after="80"/>
+        <w:pBdr>
+          <w:bottom w:val="single" w:sz="6" w:space="1" w:color="64A70B"/>
+        </w:pBdr>
+      </w:pPr>
+      <w:r>
+        <w:rPr>
+          <w:rFonts w:ascii="Arial" w:hAnsi="Arial"/>
+          <w:b/>
+          <w:color w:val="1D3A78"/>
+          <w:sz w:val="23"/>
+        </w:rPr>
+        <w:t>13.6 Grupo Econômico (Art. 20, §2º, Decreto nº 11.129/2022)</w:t>
+      </w:r>
+    </w:p>
+    <w:p>
+      <w:pPr>
+        <w:spacing w:before="0" w:after="80"/>
+      </w:pPr>
+      <w:r>
+        <w:rPr>
+          <w:rFonts w:ascii="Arial" w:hAnsi="Arial"/>
+          <w:i w:val="0"/>
+          <w:sz w:val="22"/>
+        </w:rPr>
+        <w:t>Quando há prova de que diferentes empresas agiram em conluio ou fraude estruturada como se fossem uma única entidade, configura-se o grupo econômico para fins de dosimetria. Consequências:</w:t>
+      </w:r>
+    </w:p>
+    <w:p>
+      <w:pPr>
+        <w:pStyle w:val="ListBullet"/>
+        <w:spacing w:before="0" w:after="40"/>
+        <w:ind w:left="283"/>
+      </w:pPr>
+      <w:r>
+        <w:rPr>
+          <w:rFonts w:ascii="Arial" w:hAnsi="Arial"/>
+          <w:sz w:val="22"/>
+        </w:rPr>
+        <w:t>Consolidação dos faturamentos brutos de todas as PJs participantes para compor a base de cálculo;</w:t>
+      </w:r>
+    </w:p>
+    <w:p>
+      <w:pPr>
+        <w:pStyle w:val="ListBullet"/>
+        <w:spacing w:before="0" w:after="40"/>
+        <w:ind w:left="283"/>
+      </w:pPr>
+      <w:r>
+        <w:rPr>
+          <w:rFonts w:ascii="Arial" w:hAnsi="Arial"/>
+          <w:sz w:val="22"/>
+        </w:rPr>
+        <w:t>Avaliação conjunta de agravantes e atenuantes;</w:t>
+      </w:r>
+    </w:p>
+    <w:p>
+      <w:pPr>
+        <w:pStyle w:val="ListBullet"/>
+        <w:spacing w:before="0" w:after="40"/>
+        <w:ind w:left="283"/>
+      </w:pPr>
+      <w:r>
+        <w:rPr>
+          <w:rFonts w:ascii="Arial" w:hAnsi="Arial"/>
+          <w:sz w:val="22"/>
+        </w:rPr>
+        <w:t>Consideração da vantagem auferida por todo o esquema ilícito;</w:t>
+      </w:r>
+    </w:p>
+    <w:p>
+      <w:pPr>
+        <w:pStyle w:val="ListBullet"/>
+        <w:spacing w:before="0" w:after="40"/>
+        <w:ind w:left="283"/>
+      </w:pPr>
+      <w:r>
+        <w:rPr>
+          <w:rFonts w:ascii="Arial" w:hAnsi="Arial"/>
+          <w:sz w:val="22"/>
+        </w:rPr>
+        <w:t>Solidariedade: todas as PJs integrantes respondem integralmente pelo valor total da multa aplicada.</w:t>
+      </w:r>
+    </w:p>
+    <w:p>
+      <w:r>
+        <w:br w:type="page"/>
+      </w:r>
+    </w:p>
+    <w:tbl>
+      <w:tblPr>
+        <w:tblStyle w:val="TableGrid"/>
+        <w:tblW w:type="auto" w:w="0"/>
+        <w:jc w:val="left"/>
+        <w:tblLook w:firstColumn="1" w:firstRow="1" w:lastColumn="0" w:lastRow="0" w:noHBand="0" w:noVBand="1" w:val="04A0"/>
+      </w:tblPr>
+      <w:tblGrid>
+        <w:gridCol w:w="9405"/>
+      </w:tblGrid>
+      <w:tr>
+        <w:tc>
+          <w:tcPr>
+            <w:tcW w:type="dxa" w:w="9405"/>
+            <w:shd w:val="clear" w:color="auto" w:fill="00205B"/>
+            <w:tcBorders>
+              <w:top w:val="none"/>
+              <w:left w:val="none"/>
+              <w:bottom w:val="none"/>
+              <w:right w:val="none"/>
+              <w:insideH w:val="none"/>
+              <w:insideV w:val="none"/>
+            </w:tcBorders>
+            <w:tcBorders>
+              <w:top w:val="none"/>
+              <w:left w:val="none"/>
+              <w:bottom w:val="none"/>
+              <w:right w:val="none"/>
+              <w:insideH w:val="none"/>
+              <w:insideV w:val="none"/>
+            </w:tcBorders>
+            <w:tcBorders>
+              <w:top w:val="none"/>
+              <w:left w:val="none"/>
+              <w:bottom w:val="none"/>
+              <w:right w:val="none"/>
+              <w:insideH w:val="none"/>
+              <w:insideV w:val="none"/>
+            </w:tcBorders>
+            <w:tcBorders>
+              <w:top w:val="none"/>
+              <w:left w:val="none"/>
+              <w:bottom w:val="none"/>
+              <w:right w:val="none"/>
+              <w:insideH w:val="none"/>
+              <w:insideV w:val="none"/>
+            </w:tcBorders>
+          </w:tcPr>
+          <w:p>
+            <w:pPr>
+              <w:spacing w:before="0" w:after="0"/>
+              <w:ind w:left="170"/>
+            </w:pPr>
+            <w:r>
+              <w:rPr>
+                <w:rFonts w:ascii="Arial" w:hAnsi="Arial"/>
+                <w:b/>
+                <w:color w:val="FFFFFF"/>
+                <w:sz w:val="26"/>
+              </w:rPr>
+              <w:t>14. ESTUDOS DE CASO COMENTADOS</w:t>
+            </w:r>
+          </w:p>
+        </w:tc>
+      </w:tr>
+    </w:tbl>
+    <w:p/>
+    <w:p>
+      <w:pPr>
+        <w:spacing w:before="0" w:after="80"/>
+      </w:pPr>
+      <w:r>
+        <w:rPr>
+          <w:rFonts w:ascii="Arial" w:hAnsi="Arial"/>
+          <w:i w:val="0"/>
+          <w:sz w:val="22"/>
+        </w:rPr>
+        <w:t>Os casos a seguir ilustram a aplicação concreta da dosimetria, com dados numéricos reais e as decisões metodológicas tomadas em cada etapa.</w:t>
+      </w:r>
+    </w:p>
+    <w:p>
+      <w:pPr>
+        <w:spacing w:before="240" w:after="80"/>
+        <w:pBdr>
+          <w:bottom w:val="single" w:sz="6" w:space="1" w:color="64A70B"/>
+        </w:pBdr>
+      </w:pPr>
+      <w:r>
+        <w:rPr>
+          <w:rFonts w:ascii="Arial" w:hAnsi="Arial"/>
+          <w:b/>
+          <w:color w:val="1D3A78"/>
+          <w:sz w:val="23"/>
+        </w:rPr>
+        <w:t>14.1 Caso I — Empresa Alimentos Sabor SA: Fraude em Fiscalização Tributária</w:t>
+      </w:r>
+    </w:p>
+    <w:p>
+      <w:pPr>
+        <w:spacing w:before="160" w:after="40"/>
+      </w:pPr>
+      <w:r>
+        <w:rPr>
+          <w:rFonts w:ascii="Arial" w:hAnsi="Arial"/>
+          <w:b/>
+          <w:color w:val="1D3A78"/>
+          <w:sz w:val="22"/>
+        </w:rPr>
+        <w:t>Cenário</w:t>
+      </w:r>
+    </w:p>
+    <w:p>
+      <w:pPr>
+        <w:spacing w:before="0" w:after="80"/>
+      </w:pPr>
+      <w:r>
+        <w:rPr>
+          <w:rFonts w:ascii="Arial" w:hAnsi="Arial"/>
+          <w:i w:val="0"/>
+          <w:sz w:val="22"/>
+        </w:rPr>
+        <w:t>PAR instaurado em 2025. CNPJ 12.345.678/0001-90. Ato lesivo: fraude em fiscalização tributária. Provas: Operação Policial com quebra de sigilos telemático, telefônico e bancário. Benefício econômico estimado: R$ 90.000.000,00.</w:t>
+      </w:r>
+    </w:p>
+    <w:p>
+      <w:pPr>
+        <w:spacing w:before="160" w:after="40"/>
+      </w:pPr>
+      <w:r>
+        <w:rPr>
+          <w:rFonts w:ascii="Arial" w:hAnsi="Arial"/>
+          <w:b/>
+          <w:color w:val="1D3A78"/>
+          <w:sz w:val="22"/>
+        </w:rPr>
+        <w:t>Passo 1 — Base de Cálculo (ECF/DRE da Matriz, exercício 2024)</w:t>
+      </w:r>
+    </w:p>
+    <w:tbl>
+      <w:tblPr>
+        <w:tblStyle w:val="TableGrid"/>
+        <w:tblW w:type="auto" w:w="0"/>
+        <w:jc w:val="left"/>
+        <w:tblLook w:firstColumn="1" w:firstRow="1" w:lastColumn="0" w:lastRow="0" w:noHBand="0" w:noVBand="1" w:val="04A0"/>
+      </w:tblPr>
+      <w:tblGrid>
+        <w:gridCol w:w="4702"/>
+        <w:gridCol w:w="4702"/>
+      </w:tblGrid>
+      <w:tr>
+        <w:tc>
+          <w:tcPr>
+            <w:tcW w:type="dxa" w:w="5102"/>
+            <w:shd w:val="clear" w:color="auto" w:fill="00205B"/>
+          </w:tcPr>
+          <w:p>
+            <w:pPr>
+              <w:jc w:val="center"/>
+            </w:pPr>
+            <w:r>
+              <w:rPr>
+                <w:rFonts w:ascii="Arial" w:hAnsi="Arial"/>
+                <w:b/>
+                <w:color w:val="FFFFFF"/>
+                <w:sz w:val="20"/>
+              </w:rPr>
+              <w:t>Item</w:t>
+            </w:r>
+          </w:p>
+        </w:tc>
+        <w:tc>
+          <w:tcPr>
+            <w:tcW w:type="dxa" w:w="4535"/>
+            <w:shd w:val="clear" w:color="auto" w:fill="00205B"/>
+          </w:tcPr>
+          <w:p>
+            <w:pPr>
+              <w:jc w:val="center"/>
+            </w:pPr>
+            <w:r>
+              <w:rPr>
+                <w:rFonts w:ascii="Arial" w:hAnsi="Arial"/>
+                <w:b/>
+                <w:color w:val="FFFFFF"/>
+                <w:sz w:val="20"/>
+              </w:rPr>
+              <w:t>Valor</w:t>
+            </w:r>
+          </w:p>
+        </w:tc>
+      </w:tr>
+      <w:tr>
+        <w:tc>
+          <w:tcPr>
+            <w:tcW w:type="dxa" w:w="5102"/>
+            <w:shd w:val="clear" w:color="auto" w:fill="F2F2F2"/>
+          </w:tcPr>
+          <w:p>
+            <w:pPr>
+              <w:jc w:val="left"/>
+            </w:pPr>
+            <w:r>
+              <w:rPr>
+                <w:rFonts w:ascii="Arial" w:hAnsi="Arial"/>
+                <w:sz w:val="20"/>
+              </w:rPr>
+              <w:t>Faturamento Bruto</w:t>
+            </w:r>
+          </w:p>
+        </w:tc>
+        <w:tc>
+          <w:tcPr>
+            <w:tcW w:type="dxa" w:w="4535"/>
+            <w:shd w:val="clear" w:color="auto" w:fill="F2F2F2"/>
+          </w:tcPr>
+          <w:p>
+            <w:pPr>
+              <w:jc w:val="center"/>
+            </w:pPr>
+            <w:r>
+              <w:rPr>
+                <w:rFonts w:ascii="Arial" w:hAnsi="Arial"/>
+                <w:sz w:val="20"/>
+              </w:rPr>
+              <w:t>R$ 1.248.765.432,00</w:t>
+            </w:r>
+          </w:p>
+        </w:tc>
+      </w:tr>
+      <w:tr>
+        <w:tc>
+          <w:tcPr>
+            <w:tcW w:type="dxa" w:w="5102"/>
+            <w:shd w:val="clear" w:color="auto" w:fill="FFFFFF"/>
+          </w:tcPr>
+          <w:p>
+            <w:pPr>
+              <w:jc w:val="left"/>
+            </w:pPr>
+            <w:r>
+              <w:rPr>
+                <w:rFonts w:ascii="Arial" w:hAnsi="Arial"/>
+                <w:sz w:val="20"/>
+              </w:rPr>
+              <w:t>(−) Tributos Incidentes</w:t>
+            </w:r>
+          </w:p>
+        </w:tc>
+        <w:tc>
+          <w:tcPr>
+            <w:tcW w:type="dxa" w:w="4535"/>
+            <w:shd w:val="clear" w:color="auto" w:fill="FFFFFF"/>
+          </w:tcPr>
+          <w:p>
+            <w:pPr>
+              <w:jc w:val="center"/>
+            </w:pPr>
+            <w:r>
+              <w:rPr>
+                <w:rFonts w:ascii="Arial" w:hAnsi="Arial"/>
+                <w:sz w:val="20"/>
+              </w:rPr>
+              <w:t>(R$ 188.653.322,00)</w:t>
+            </w:r>
+          </w:p>
+        </w:tc>
+      </w:tr>
+      <w:tr>
+        <w:tc>
+          <w:tcPr>
+            <w:tcW w:type="dxa" w:w="5102"/>
+            <w:shd w:val="clear" w:color="auto" w:fill="F2F2F2"/>
+          </w:tcPr>
+          <w:p>
+            <w:pPr>
+              <w:jc w:val="left"/>
+            </w:pPr>
+            <w:r>
+              <w:rPr>
+                <w:rFonts w:ascii="Arial" w:hAnsi="Arial"/>
+                <w:sz w:val="20"/>
+              </w:rPr>
+              <w:t>Base de Cálculo Final</w:t>
+            </w:r>
+          </w:p>
+        </w:tc>
+        <w:tc>
+          <w:tcPr>
+            <w:tcW w:type="dxa" w:w="4535"/>
+            <w:shd w:val="clear" w:color="auto" w:fill="F2F2F2"/>
+          </w:tcPr>
+          <w:p>
+            <w:pPr>
+              <w:jc w:val="center"/>
+            </w:pPr>
+            <w:r>
+              <w:rPr>
+                <w:rFonts w:ascii="Arial" w:hAnsi="Arial"/>
+                <w:sz w:val="20"/>
+              </w:rPr>
+              <w:t>R$ 1.060.112.110,00</w:t>
+            </w:r>
+          </w:p>
+        </w:tc>
+      </w:tr>
+    </w:tbl>
+    <w:p/>
+    <w:p>
+      <w:pPr>
+        <w:spacing w:before="160" w:after="40"/>
+      </w:pPr>
+      <w:r>
+        <w:rPr>
+          <w:rFonts w:ascii="Arial" w:hAnsi="Arial"/>
+          <w:b/>
+          <w:color w:val="1D3A78"/>
+          <w:sz w:val="22"/>
+        </w:rPr>
+        <w:t>Passo 2 — Agravantes e Atenuantes</w:t>
+      </w:r>
+    </w:p>
+    <w:tbl>
+      <w:tblPr>
+        <w:tblStyle w:val="TableGrid"/>
+        <w:tblW w:type="auto" w:w="0"/>
+        <w:jc w:val="left"/>
+        <w:tblLook w:firstColumn="1" w:firstRow="1" w:lastColumn="0" w:lastRow="0" w:noHBand="0" w:noVBand="1" w:val="04A0"/>
+      </w:tblPr>
+      <w:tblGrid>
+        <w:gridCol w:w="3135"/>
+        <w:gridCol w:w="3135"/>
+        <w:gridCol w:w="3135"/>
+      </w:tblGrid>
+      <w:tr>
+        <w:tc>
+          <w:tcPr>
+            <w:tcW w:type="dxa" w:w="2835"/>
+            <w:shd w:val="clear" w:color="auto" w:fill="00205B"/>
+          </w:tcPr>
+          <w:p>
+            <w:pPr>
+              <w:jc w:val="center"/>
+            </w:pPr>
+            <w:r>
+              <w:rPr>
+                <w:rFonts w:ascii="Arial" w:hAnsi="Arial"/>
+                <w:b/>
+                <w:color w:val="FFFFFF"/>
+                <w:sz w:val="20"/>
+              </w:rPr>
+              <w:t>Circunstância</w:t>
+            </w:r>
+          </w:p>
+        </w:tc>
+        <w:tc>
+          <w:tcPr>
+            <w:tcW w:type="dxa" w:w="5386"/>
+            <w:shd w:val="clear" w:color="auto" w:fill="00205B"/>
+          </w:tcPr>
+          <w:p>
+            <w:pPr>
+              <w:jc w:val="center"/>
+            </w:pPr>
+            <w:r>
+              <w:rPr>
+                <w:rFonts w:ascii="Arial" w:hAnsi="Arial"/>
+                <w:b/>
+                <w:color w:val="FFFFFF"/>
+                <w:sz w:val="20"/>
+              </w:rPr>
+              <w:t>Fundamentação</w:t>
+            </w:r>
+          </w:p>
+        </w:tc>
+        <w:tc>
+          <w:tcPr>
+            <w:tcW w:type="dxa" w:w="1417"/>
+            <w:shd w:val="clear" w:color="auto" w:fill="00205B"/>
+          </w:tcPr>
+          <w:p>
+            <w:pPr>
+              <w:jc w:val="center"/>
+            </w:pPr>
+            <w:r>
+              <w:rPr>
+                <w:rFonts w:ascii="Arial" w:hAnsi="Arial"/>
+                <w:b/>
+                <w:color w:val="FFFFFF"/>
+                <w:sz w:val="20"/>
+              </w:rPr>
+              <w:t>%</w:t>
+            </w:r>
+          </w:p>
+        </w:tc>
+      </w:tr>
+      <w:tr>
+        <w:tc>
+          <w:tcPr>
+            <w:tcW w:type="dxa" w:w="2835"/>
+            <w:shd w:val="clear" w:color="auto" w:fill="F2F2F2"/>
+          </w:tcPr>
+          <w:p>
+            <w:pPr>
+              <w:jc w:val="left"/>
+            </w:pPr>
+            <w:r>
+              <w:rPr>
+                <w:rFonts w:ascii="Arial" w:hAnsi="Arial"/>
+                <w:sz w:val="20"/>
+              </w:rPr>
+              <w:t>Art. 22, I — Concurso de atos</w:t>
+            </w:r>
+          </w:p>
+        </w:tc>
+        <w:tc>
+          <w:tcPr>
+            <w:tcW w:type="dxa" w:w="5386"/>
+            <w:shd w:val="clear" w:color="auto" w:fill="F2F2F2"/>
+          </w:tcPr>
+          <w:p>
+            <w:pPr>
+              <w:jc w:val="center"/>
+            </w:pPr>
+            <w:r>
+              <w:rPr>
+                <w:rFonts w:ascii="Arial" w:hAnsi="Arial"/>
+                <w:sz w:val="20"/>
+              </w:rPr>
+              <w:t>Múltiplos pagamentos dissimulados (R$ 450k via empresa B, R$ 250k via empresa C, R$ 180k em móveis para o auditor)</w:t>
+            </w:r>
+          </w:p>
+        </w:tc>
+        <w:tc>
+          <w:tcPr>
+            <w:tcW w:type="dxa" w:w="1417"/>
+            <w:shd w:val="clear" w:color="auto" w:fill="F2F2F2"/>
+          </w:tcPr>
+          <w:p>
+            <w:pPr>
+              <w:jc w:val="center"/>
+            </w:pPr>
+            <w:r>
+              <w:rPr>
+                <w:rFonts w:ascii="Arial" w:hAnsi="Arial"/>
+                <w:sz w:val="20"/>
+              </w:rPr>
+              <w:t>3,5%</w:t>
+            </w:r>
+          </w:p>
+        </w:tc>
+      </w:tr>
+      <w:tr>
+        <w:tc>
+          <w:tcPr>
+            <w:tcW w:type="dxa" w:w="2835"/>
+            <w:shd w:val="clear" w:color="auto" w:fill="FFFFFF"/>
+          </w:tcPr>
+          <w:p>
+            <w:pPr>
+              <w:jc w:val="left"/>
+            </w:pPr>
+            <w:r>
+              <w:rPr>
+                <w:rFonts w:ascii="Arial" w:hAnsi="Arial"/>
+                <w:sz w:val="20"/>
+              </w:rPr>
+              <w:t>Art. 22, II — Ciência do corpo diretivo</w:t>
+            </w:r>
+          </w:p>
+        </w:tc>
+        <w:tc>
+          <w:tcPr>
+            <w:tcW w:type="dxa" w:w="5386"/>
+            <w:shd w:val="clear" w:color="auto" w:fill="FFFFFF"/>
+          </w:tcPr>
+          <w:p>
+            <w:pPr>
+              <w:jc w:val="center"/>
+            </w:pPr>
+            <w:r>
+              <w:rPr>
+                <w:rFonts w:ascii="Arial" w:hAnsi="Arial"/>
+                <w:sz w:val="20"/>
+              </w:rPr>
+              <w:t>WhatsApp do gerente citando o Administrador; e-mails copiados ao contador e auditor → ciência do Administrador (teto)</w:t>
+            </w:r>
+          </w:p>
+        </w:tc>
+        <w:tc>
+          <w:tcPr>
+            <w:tcW w:type="dxa" w:w="1417"/>
+            <w:shd w:val="clear" w:color="auto" w:fill="FFFFFF"/>
+          </w:tcPr>
+          <w:p>
+            <w:pPr>
+              <w:jc w:val="center"/>
+            </w:pPr>
+            <w:r>
+              <w:rPr>
+                <w:rFonts w:ascii="Arial" w:hAnsi="Arial"/>
+                <w:sz w:val="20"/>
+              </w:rPr>
+              <w:t>3,0%</w:t>
+            </w:r>
+          </w:p>
+        </w:tc>
+      </w:tr>
+      <w:tr>
+        <w:tc>
+          <w:tcPr>
+            <w:tcW w:type="dxa" w:w="2835"/>
+            <w:shd w:val="clear" w:color="auto" w:fill="F2F2F2"/>
+          </w:tcPr>
+          <w:p>
+            <w:pPr>
+              <w:jc w:val="left"/>
+            </w:pPr>
+            <w:r>
+              <w:rPr>
+                <w:rFonts w:ascii="Arial" w:hAnsi="Arial"/>
+                <w:sz w:val="20"/>
+              </w:rPr>
+              <w:t>Art. 22, III — Interrupção</w:t>
+            </w:r>
+          </w:p>
+        </w:tc>
+        <w:tc>
+          <w:tcPr>
+            <w:tcW w:type="dxa" w:w="5386"/>
+            <w:shd w:val="clear" w:color="auto" w:fill="F2F2F2"/>
+          </w:tcPr>
+          <w:p>
+            <w:pPr>
+              <w:jc w:val="center"/>
+            </w:pPr>
+            <w:r>
+              <w:rPr>
+                <w:rFonts w:ascii="Arial" w:hAnsi="Arial"/>
+                <w:sz w:val="20"/>
+              </w:rPr>
+              <w:t>Não aplicável ao caso</w:t>
+            </w:r>
+          </w:p>
+        </w:tc>
+        <w:tc>
+          <w:tcPr>
+            <w:tcW w:type="dxa" w:w="1417"/>
+            <w:shd w:val="clear" w:color="auto" w:fill="F2F2F2"/>
+          </w:tcPr>
+          <w:p>
+            <w:pPr>
+              <w:jc w:val="center"/>
+            </w:pPr>
+            <w:r>
+              <w:rPr>
+                <w:rFonts w:ascii="Arial" w:hAnsi="Arial"/>
+                <w:sz w:val="20"/>
+              </w:rPr>
+              <w:t>0%</w:t>
+            </w:r>
+          </w:p>
+        </w:tc>
+      </w:tr>
+      <w:tr>
+        <w:tc>
+          <w:tcPr>
+            <w:tcW w:type="dxa" w:w="2835"/>
+            <w:shd w:val="clear" w:color="auto" w:fill="FFFFFF"/>
+          </w:tcPr>
+          <w:p>
+            <w:pPr>
+              <w:jc w:val="left"/>
+            </w:pPr>
+            <w:r>
+              <w:rPr>
+                <w:rFonts w:ascii="Arial" w:hAnsi="Arial"/>
+                <w:sz w:val="20"/>
+              </w:rPr>
+              <w:t>Art. 22, IV — Situação econômica</w:t>
+            </w:r>
+          </w:p>
+        </w:tc>
+        <w:tc>
+          <w:tcPr>
+            <w:tcW w:type="dxa" w:w="5386"/>
+            <w:shd w:val="clear" w:color="auto" w:fill="FFFFFF"/>
+          </w:tcPr>
+          <w:p>
+            <w:pPr>
+              <w:jc w:val="center"/>
+            </w:pPr>
+            <w:r>
+              <w:rPr>
+                <w:rFonts w:ascii="Arial" w:hAnsi="Arial"/>
+                <w:sz w:val="20"/>
+              </w:rPr>
+              <w:t>SG = 1,67 ✓ / LG = 0,98 ✗ / Lucro ✓ — LG &lt; 1, não se aplica</w:t>
+            </w:r>
+          </w:p>
+        </w:tc>
+        <w:tc>
+          <w:tcPr>
+            <w:tcW w:type="dxa" w:w="1417"/>
+            <w:shd w:val="clear" w:color="auto" w:fill="FFFFFF"/>
+          </w:tcPr>
+          <w:p>
+            <w:pPr>
+              <w:jc w:val="center"/>
+            </w:pPr>
+            <w:r>
+              <w:rPr>
+                <w:rFonts w:ascii="Arial" w:hAnsi="Arial"/>
+                <w:sz w:val="20"/>
+              </w:rPr>
+              <w:t>0%</w:t>
+            </w:r>
+          </w:p>
+        </w:tc>
+      </w:tr>
+      <w:tr>
+        <w:tc>
+          <w:tcPr>
+            <w:tcW w:type="dxa" w:w="2835"/>
+            <w:shd w:val="clear" w:color="auto" w:fill="F2F2F2"/>
+          </w:tcPr>
+          <w:p>
+            <w:pPr>
+              <w:jc w:val="left"/>
+            </w:pPr>
+            <w:r>
+              <w:rPr>
+                <w:rFonts w:ascii="Arial" w:hAnsi="Arial"/>
+                <w:sz w:val="20"/>
+              </w:rPr>
+              <w:t>Art. 22, V — Reincidência</w:t>
+            </w:r>
+          </w:p>
+        </w:tc>
+        <w:tc>
+          <w:tcPr>
+            <w:tcW w:type="dxa" w:w="5386"/>
+            <w:shd w:val="clear" w:color="auto" w:fill="F2F2F2"/>
+          </w:tcPr>
+          <w:p>
+            <w:pPr>
+              <w:jc w:val="center"/>
+            </w:pPr>
+            <w:r>
+              <w:rPr>
+                <w:rFonts w:ascii="Arial" w:hAnsi="Arial"/>
+                <w:sz w:val="20"/>
+              </w:rPr>
+              <w:t>PAR anterior em andamento sem julgamento definitivo — NÃO configura reincidência</w:t>
+            </w:r>
+          </w:p>
+        </w:tc>
+        <w:tc>
+          <w:tcPr>
+            <w:tcW w:type="dxa" w:w="1417"/>
+            <w:shd w:val="clear" w:color="auto" w:fill="F2F2F2"/>
+          </w:tcPr>
+          <w:p>
+            <w:pPr>
+              <w:jc w:val="center"/>
+            </w:pPr>
+            <w:r>
+              <w:rPr>
+                <w:rFonts w:ascii="Arial" w:hAnsi="Arial"/>
+                <w:sz w:val="20"/>
+              </w:rPr>
+              <w:t>0%</w:t>
+            </w:r>
+          </w:p>
+        </w:tc>
+      </w:tr>
+      <w:tr>
+        <w:tc>
+          <w:tcPr>
+            <w:tcW w:type="dxa" w:w="2835"/>
+            <w:shd w:val="clear" w:color="auto" w:fill="FFFFFF"/>
+          </w:tcPr>
+          <w:p>
+            <w:pPr>
+              <w:jc w:val="left"/>
+            </w:pPr>
+            <w:r>
+              <w:rPr>
+                <w:rFonts w:ascii="Arial" w:hAnsi="Arial"/>
+                <w:sz w:val="20"/>
+              </w:rPr>
+              <w:t>Art. 22, VI — Contratos</w:t>
+            </w:r>
+          </w:p>
+        </w:tc>
+        <w:tc>
+          <w:tcPr>
+            <w:tcW w:type="dxa" w:w="5386"/>
+            <w:shd w:val="clear" w:color="auto" w:fill="FFFFFF"/>
+          </w:tcPr>
+          <w:p>
+            <w:pPr>
+              <w:jc w:val="center"/>
+            </w:pPr>
+            <w:r>
+              <w:rPr>
+                <w:rFonts w:ascii="Arial" w:hAnsi="Arial"/>
+                <w:sz w:val="20"/>
+              </w:rPr>
+              <w:t>Não pontuado no caso</w:t>
+            </w:r>
+          </w:p>
+        </w:tc>
+        <w:tc>
+          <w:tcPr>
+            <w:tcW w:type="dxa" w:w="1417"/>
+            <w:shd w:val="clear" w:color="auto" w:fill="FFFFFF"/>
+          </w:tcPr>
+          <w:p>
+            <w:pPr>
+              <w:jc w:val="center"/>
+            </w:pPr>
+            <w:r>
+              <w:rPr>
+                <w:rFonts w:ascii="Arial" w:hAnsi="Arial"/>
+                <w:sz w:val="20"/>
+              </w:rPr>
+              <w:t>0%</w:t>
+            </w:r>
+          </w:p>
+        </w:tc>
+      </w:tr>
+      <w:tr>
+        <w:tc>
+          <w:tcPr>
+            <w:tcW w:type="dxa" w:w="2835"/>
+            <w:shd w:val="clear" w:color="auto" w:fill="F2F2F2"/>
+          </w:tcPr>
+          <w:p>
+            <w:pPr>
+              <w:jc w:val="left"/>
+            </w:pPr>
+            <w:r>
+              <w:rPr>
+                <w:rFonts w:ascii="Arial" w:hAnsi="Arial"/>
+                <w:sz w:val="20"/>
+              </w:rPr>
+              <w:t>TOTAL AGRAVANTES</w:t>
+            </w:r>
+          </w:p>
+        </w:tc>
+        <w:tc>
+          <w:tcPr>
+            <w:tcW w:type="dxa" w:w="5386"/>
+            <w:shd w:val="clear" w:color="auto" w:fill="F2F2F2"/>
+          </w:tcPr>
+          <w:p>
+            <w:pPr>
+              <w:jc w:val="center"/>
+            </w:pPr>
+            <w:r>
+              <w:rPr>
+                <w:rFonts w:ascii="Arial" w:hAnsi="Arial"/>
+                <w:sz w:val="20"/>
+              </w:rPr>
+            </w:r>
+          </w:p>
+        </w:tc>
+        <w:tc>
+          <w:tcPr>
+            <w:tcW w:type="dxa" w:w="1417"/>
+            <w:shd w:val="clear" w:color="auto" w:fill="F2F2F2"/>
+          </w:tcPr>
+          <w:p>
+            <w:pPr>
+              <w:jc w:val="center"/>
+            </w:pPr>
+            <w:r>
+              <w:rPr>
+                <w:rFonts w:ascii="Arial" w:hAnsi="Arial"/>
+                <w:sz w:val="20"/>
+              </w:rPr>
+              <w:t>6,5%</w:t>
+            </w:r>
+          </w:p>
+        </w:tc>
+      </w:tr>
+      <w:tr>
+        <w:tc>
+          <w:tcPr>
+            <w:tcW w:type="dxa" w:w="2835"/>
+            <w:shd w:val="clear" w:color="auto" w:fill="FFFFFF"/>
+          </w:tcPr>
+          <w:p>
+            <w:pPr>
+              <w:jc w:val="left"/>
+            </w:pPr>
+            <w:r>
+              <w:rPr>
+                <w:rFonts w:ascii="Arial" w:hAnsi="Arial"/>
+                <w:sz w:val="20"/>
+              </w:rPr>
+              <w:t>Art. 23, II — Ressarcimento</w:t>
+            </w:r>
+          </w:p>
+        </w:tc>
+        <w:tc>
+          <w:tcPr>
+            <w:tcW w:type="dxa" w:w="5386"/>
+            <w:shd w:val="clear" w:color="auto" w:fill="FFFFFF"/>
+          </w:tcPr>
+          <w:p>
+            <w:pPr>
+              <w:jc w:val="center"/>
+            </w:pPr>
+            <w:r>
+              <w:rPr>
+                <w:rFonts w:ascii="Arial" w:hAnsi="Arial"/>
+                <w:sz w:val="20"/>
+              </w:rPr>
+              <w:t>Comprovação parcial de devolução espontânea</w:t>
+            </w:r>
+          </w:p>
+        </w:tc>
+        <w:tc>
+          <w:tcPr>
+            <w:tcW w:type="dxa" w:w="1417"/>
+            <w:shd w:val="clear" w:color="auto" w:fill="FFFFFF"/>
+          </w:tcPr>
+          <w:p>
+            <w:pPr>
+              <w:jc w:val="center"/>
+            </w:pPr>
+            <w:r>
+              <w:rPr>
+                <w:rFonts w:ascii="Arial" w:hAnsi="Arial"/>
+                <w:sz w:val="20"/>
+              </w:rPr>
+              <w:t>−0,5%</w:t>
+            </w:r>
+          </w:p>
+        </w:tc>
+      </w:tr>
+      <w:tr>
+        <w:tc>
+          <w:tcPr>
+            <w:tcW w:type="dxa" w:w="2835"/>
+            <w:shd w:val="clear" w:color="auto" w:fill="F2F2F2"/>
+          </w:tcPr>
+          <w:p>
+            <w:pPr>
+              <w:jc w:val="left"/>
+            </w:pPr>
+            <w:r>
+              <w:rPr>
+                <w:rFonts w:ascii="Arial" w:hAnsi="Arial"/>
+                <w:sz w:val="20"/>
+              </w:rPr>
+              <w:t>TOTAL ATENUANTES</w:t>
+            </w:r>
+          </w:p>
+        </w:tc>
+        <w:tc>
+          <w:tcPr>
+            <w:tcW w:type="dxa" w:w="5386"/>
+            <w:shd w:val="clear" w:color="auto" w:fill="F2F2F2"/>
+          </w:tcPr>
+          <w:p>
+            <w:pPr>
+              <w:jc w:val="center"/>
+            </w:pPr>
+            <w:r>
+              <w:rPr>
+                <w:rFonts w:ascii="Arial" w:hAnsi="Arial"/>
+                <w:sz w:val="20"/>
+              </w:rPr>
+            </w:r>
+          </w:p>
+        </w:tc>
+        <w:tc>
+          <w:tcPr>
+            <w:tcW w:type="dxa" w:w="1417"/>
+            <w:shd w:val="clear" w:color="auto" w:fill="F2F2F2"/>
+          </w:tcPr>
+          <w:p>
+            <w:pPr>
+              <w:jc w:val="center"/>
+            </w:pPr>
+            <w:r>
+              <w:rPr>
+                <w:rFonts w:ascii="Arial" w:hAnsi="Arial"/>
+                <w:sz w:val="20"/>
+              </w:rPr>
+              <w:t>−0,5%</w:t>
+            </w:r>
+          </w:p>
+        </w:tc>
+      </w:tr>
+      <w:tr>
+        <w:tc>
+          <w:tcPr>
+            <w:tcW w:type="dxa" w:w="2835"/>
+            <w:shd w:val="clear" w:color="auto" w:fill="FFFFFF"/>
+          </w:tcPr>
+          <w:p>
+            <w:pPr>
+              <w:jc w:val="left"/>
+            </w:pPr>
+            <w:r>
+              <w:rPr>
+                <w:rFonts w:ascii="Arial" w:hAnsi="Arial"/>
+                <w:sz w:val="20"/>
+              </w:rPr>
+              <w:t>ALÍQUOTA FINAL</w:t>
+            </w:r>
+          </w:p>
+        </w:tc>
+        <w:tc>
+          <w:tcPr>
+            <w:tcW w:type="dxa" w:w="5386"/>
+            <w:shd w:val="clear" w:color="auto" w:fill="FFFFFF"/>
+          </w:tcPr>
+          <w:p>
+            <w:pPr>
+              <w:jc w:val="center"/>
+            </w:pPr>
+            <w:r>
+              <w:rPr>
+                <w:rFonts w:ascii="Arial" w:hAnsi="Arial"/>
+                <w:sz w:val="20"/>
+              </w:rPr>
+              <w:t>6,5% − 0,5%</w:t>
+            </w:r>
+          </w:p>
+        </w:tc>
+        <w:tc>
+          <w:tcPr>
+            <w:tcW w:type="dxa" w:w="1417"/>
+            <w:shd w:val="clear" w:color="auto" w:fill="FFFFFF"/>
+          </w:tcPr>
+          <w:p>
+            <w:pPr>
+              <w:jc w:val="center"/>
+            </w:pPr>
+            <w:r>
+              <w:rPr>
+                <w:rFonts w:ascii="Arial" w:hAnsi="Arial"/>
+                <w:sz w:val="20"/>
+              </w:rPr>
+              <w:t>6,0%</w:t>
+            </w:r>
+          </w:p>
+        </w:tc>
+      </w:tr>
+    </w:tbl>
+    <w:p/>
+    <w:p>
+      <w:pPr>
+        <w:spacing w:before="160" w:after="40"/>
+      </w:pPr>
+      <w:r>
+        <w:rPr>
+          <w:rFonts w:ascii="Arial" w:hAnsi="Arial"/>
+          <w:b/>
+          <w:color w:val="1D3A78"/>
+          <w:sz w:val="22"/>
+        </w:rPr>
+        <w:t>Passo 3 — Multa Preliminar</w:t>
+      </w:r>
+    </w:p>
+    <w:p>
+      <w:pPr>
+        <w:spacing w:before="80" w:after="80"/>
+        <w:ind w:left="850" w:right="567"/>
+      </w:pPr>
+      <w:r>
+        <w:rPr>
+          <w:rFonts w:ascii="Arial" w:hAnsi="Arial"/>
+          <w:i/>
+          <w:color w:val="333366"/>
+          <w:sz w:val="20"/>
+        </w:rPr>
+        <w:t>R$ 1.060.112.110,00 × 6,0%  =  R$ 63.606.726,60</w:t>
+      </w:r>
+    </w:p>
+    <w:p>
+      <w:pPr>
+        <w:spacing w:before="160" w:after="40"/>
+      </w:pPr>
+      <w:r>
+        <w:rPr>
+          <w:rFonts w:ascii="Arial" w:hAnsi="Arial"/>
+          <w:b/>
+          <w:color w:val="1D3A78"/>
+          <w:sz w:val="22"/>
+        </w:rPr>
+        <w:t>Passo 4 — Limites Legais</w:t>
+      </w:r>
+    </w:p>
+    <w:tbl>
+      <w:tblPr>
+        <w:tblStyle w:val="TableGrid"/>
+        <w:tblW w:type="auto" w:w="0"/>
+        <w:jc w:val="left"/>
+        <w:tblLook w:firstColumn="1" w:firstRow="1" w:lastColumn="0" w:lastRow="0" w:noHBand="0" w:noVBand="1" w:val="04A0"/>
+      </w:tblPr>
+      <w:tblGrid>
+        <w:gridCol w:w="3135"/>
+        <w:gridCol w:w="3135"/>
+        <w:gridCol w:w="3135"/>
+      </w:tblGrid>
+      <w:tr>
+        <w:tc>
+          <w:tcPr>
+            <w:tcW w:type="dxa" w:w="3118"/>
+            <w:shd w:val="clear" w:color="auto" w:fill="00205B"/>
+          </w:tcPr>
+          <w:p>
+            <w:pPr>
+              <w:jc w:val="center"/>
+            </w:pPr>
+            <w:r>
+              <w:rPr>
+                <w:rFonts w:ascii="Arial" w:hAnsi="Arial"/>
+                <w:b/>
+                <w:color w:val="FFFFFF"/>
+                <w:sz w:val="20"/>
+              </w:rPr>
+              <w:t>Limite</w:t>
+            </w:r>
+          </w:p>
+        </w:tc>
+        <w:tc>
+          <w:tcPr>
+            <w:tcW w:type="dxa" w:w="3969"/>
+            <w:shd w:val="clear" w:color="auto" w:fill="00205B"/>
+          </w:tcPr>
+          <w:p>
+            <w:pPr>
+              <w:jc w:val="center"/>
+            </w:pPr>
+            <w:r>
+              <w:rPr>
+                <w:rFonts w:ascii="Arial" w:hAnsi="Arial"/>
+                <w:b/>
+                <w:color w:val="FFFFFF"/>
+                <w:sz w:val="20"/>
+              </w:rPr>
+              <w:t>Fórmula</w:t>
+            </w:r>
+          </w:p>
+        </w:tc>
+        <w:tc>
+          <w:tcPr>
+            <w:tcW w:type="dxa" w:w="2835"/>
+            <w:shd w:val="clear" w:color="auto" w:fill="00205B"/>
+          </w:tcPr>
+          <w:p>
+            <w:pPr>
+              <w:jc w:val="center"/>
+            </w:pPr>
+            <w:r>
+              <w:rPr>
+                <w:rFonts w:ascii="Arial" w:hAnsi="Arial"/>
+                <w:b/>
+                <w:color w:val="FFFFFF"/>
+                <w:sz w:val="20"/>
+              </w:rPr>
+              <w:t>Valor</w:t>
+            </w:r>
+          </w:p>
+        </w:tc>
+      </w:tr>
+      <w:tr>
+        <w:tc>
+          <w:tcPr>
+            <w:tcW w:type="dxa" w:w="3118"/>
+            <w:shd w:val="clear" w:color="auto" w:fill="F2F2F2"/>
+          </w:tcPr>
+          <w:p>
+            <w:pPr>
+              <w:jc w:val="left"/>
+            </w:pPr>
+            <w:r>
+              <w:rPr>
+                <w:rFonts w:ascii="Arial" w:hAnsi="Arial"/>
+                <w:sz w:val="20"/>
+              </w:rPr>
+              <w:t>Mínimo (maior entre os dois)</w:t>
+            </w:r>
+          </w:p>
+        </w:tc>
+        <w:tc>
+          <w:tcPr>
+            <w:tcW w:type="dxa" w:w="3969"/>
+            <w:shd w:val="clear" w:color="auto" w:fill="F2F2F2"/>
+          </w:tcPr>
+          <w:p>
+            <w:pPr>
+              <w:jc w:val="center"/>
+            </w:pPr>
+            <w:r>
+              <w:rPr>
+                <w:rFonts w:ascii="Arial" w:hAnsi="Arial"/>
+                <w:sz w:val="20"/>
+              </w:rPr>
+              <w:t>Vantagem Auferida (após refiscalização)</w:t>
+            </w:r>
+          </w:p>
+        </w:tc>
+        <w:tc>
+          <w:tcPr>
+            <w:tcW w:type="dxa" w:w="2835"/>
+            <w:shd w:val="clear" w:color="auto" w:fill="F2F2F2"/>
+          </w:tcPr>
+          <w:p>
+            <w:pPr>
+              <w:jc w:val="center"/>
+            </w:pPr>
+            <w:r>
+              <w:rPr>
+                <w:rFonts w:ascii="Arial" w:hAnsi="Arial"/>
+                <w:sz w:val="20"/>
+              </w:rPr>
+              <w:t>R$ 60.000.000,00</w:t>
+            </w:r>
+          </w:p>
+        </w:tc>
+      </w:tr>
+      <w:tr>
+        <w:tc>
+          <w:tcPr>
+            <w:tcW w:type="dxa" w:w="3118"/>
+            <w:shd w:val="clear" w:color="auto" w:fill="FFFFFF"/>
+          </w:tcPr>
+          <w:p>
+            <w:pPr>
+              <w:jc w:val="left"/>
+            </w:pPr>
+            <w:r>
+              <w:rPr>
+                <w:rFonts w:ascii="Arial" w:hAnsi="Arial"/>
+                <w:sz w:val="20"/>
+              </w:rPr>
+            </w:r>
+          </w:p>
+        </w:tc>
+        <w:tc>
+          <w:tcPr>
+            <w:tcW w:type="dxa" w:w="3969"/>
+            <w:shd w:val="clear" w:color="auto" w:fill="FFFFFF"/>
+          </w:tcPr>
+          <w:p>
+            <w:pPr>
+              <w:jc w:val="center"/>
+            </w:pPr>
+            <w:r>
+              <w:rPr>
+                <w:rFonts w:ascii="Arial" w:hAnsi="Arial"/>
+                <w:sz w:val="20"/>
+              </w:rPr>
+              <w:t>0,1% do Faturamento</w:t>
+            </w:r>
+          </w:p>
+        </w:tc>
+        <w:tc>
+          <w:tcPr>
+            <w:tcW w:type="dxa" w:w="2835"/>
+            <w:shd w:val="clear" w:color="auto" w:fill="FFFFFF"/>
+          </w:tcPr>
+          <w:p>
+            <w:pPr>
+              <w:jc w:val="center"/>
+            </w:pPr>
+            <w:r>
+              <w:rPr>
+                <w:rFonts w:ascii="Arial" w:hAnsi="Arial"/>
+                <w:sz w:val="20"/>
+              </w:rPr>
+              <w:t>R$ 1.060.112,11</w:t>
+            </w:r>
+          </w:p>
+        </w:tc>
+      </w:tr>
+      <w:tr>
+        <w:tc>
+          <w:tcPr>
+            <w:tcW w:type="dxa" w:w="3118"/>
+            <w:shd w:val="clear" w:color="auto" w:fill="F2F2F2"/>
+          </w:tcPr>
+          <w:p>
+            <w:pPr>
+              <w:jc w:val="left"/>
+            </w:pPr>
+            <w:r>
+              <w:rPr>
+                <w:rFonts w:ascii="Arial" w:hAnsi="Arial"/>
+                <w:sz w:val="20"/>
+              </w:rPr>
+              <w:t>Máximo (menor entre os dois)</w:t>
+            </w:r>
+          </w:p>
+        </w:tc>
+        <w:tc>
+          <w:tcPr>
+            <w:tcW w:type="dxa" w:w="3969"/>
+            <w:shd w:val="clear" w:color="auto" w:fill="F2F2F2"/>
+          </w:tcPr>
+          <w:p>
+            <w:pPr>
+              <w:jc w:val="center"/>
+            </w:pPr>
+            <w:r>
+              <w:rPr>
+                <w:rFonts w:ascii="Arial" w:hAnsi="Arial"/>
+                <w:sz w:val="20"/>
+              </w:rPr>
+              <w:t>20% do Faturamento</w:t>
+            </w:r>
+          </w:p>
+        </w:tc>
+        <w:tc>
+          <w:tcPr>
+            <w:tcW w:type="dxa" w:w="2835"/>
+            <w:shd w:val="clear" w:color="auto" w:fill="F2F2F2"/>
+          </w:tcPr>
+          <w:p>
+            <w:pPr>
+              <w:jc w:val="center"/>
+            </w:pPr>
+            <w:r>
+              <w:rPr>
+                <w:rFonts w:ascii="Arial" w:hAnsi="Arial"/>
+                <w:sz w:val="20"/>
+              </w:rPr>
+              <w:t>R$ 212.022.422,00</w:t>
+            </w:r>
+          </w:p>
+        </w:tc>
+      </w:tr>
+      <w:tr>
+        <w:tc>
+          <w:tcPr>
+            <w:tcW w:type="dxa" w:w="3118"/>
+            <w:shd w:val="clear" w:color="auto" w:fill="FFFFFF"/>
+          </w:tcPr>
+          <w:p>
+            <w:pPr>
+              <w:jc w:val="left"/>
+            </w:pPr>
+            <w:r>
+              <w:rPr>
+                <w:rFonts w:ascii="Arial" w:hAnsi="Arial"/>
+                <w:sz w:val="20"/>
+              </w:rPr>
+            </w:r>
+          </w:p>
+        </w:tc>
+        <w:tc>
+          <w:tcPr>
+            <w:tcW w:type="dxa" w:w="3969"/>
+            <w:shd w:val="clear" w:color="auto" w:fill="FFFFFF"/>
+          </w:tcPr>
+          <w:p>
+            <w:pPr>
+              <w:jc w:val="center"/>
+            </w:pPr>
+            <w:r>
+              <w:rPr>
+                <w:rFonts w:ascii="Arial" w:hAnsi="Arial"/>
+                <w:sz w:val="20"/>
+              </w:rPr>
+              <w:t>3 × Vantagem Pretendida (R$ 90M)</w:t>
+            </w:r>
+          </w:p>
+        </w:tc>
+        <w:tc>
+          <w:tcPr>
+            <w:tcW w:type="dxa" w:w="2835"/>
+            <w:shd w:val="clear" w:color="auto" w:fill="FFFFFF"/>
+          </w:tcPr>
+          <w:p>
+            <w:pPr>
+              <w:jc w:val="center"/>
+            </w:pPr>
+            <w:r>
+              <w:rPr>
+                <w:rFonts w:ascii="Arial" w:hAnsi="Arial"/>
+                <w:sz w:val="20"/>
+              </w:rPr>
+              <w:t>R$ 270.000.000,00</w:t>
+            </w:r>
+          </w:p>
+        </w:tc>
+      </w:tr>
+    </w:tbl>
+    <w:p/>
+    <w:p>
+      <w:pPr>
+        <w:spacing w:before="160" w:after="40"/>
+      </w:pPr>
+      <w:r>
+        <w:rPr>
+          <w:rFonts w:ascii="Arial" w:hAnsi="Arial"/>
+          <w:b/>
+          <w:color w:val="1D3A78"/>
+          <w:sz w:val="22"/>
+        </w:rPr>
+        <w:t>Passo 5 — Multa Final (Caso I)</w:t>
+      </w:r>
+    </w:p>
+    <w:p>
+      <w:pPr>
+        <w:spacing w:before="0" w:after="80"/>
+      </w:pPr>
+      <w:r>
+        <w:rPr>
+          <w:rFonts w:ascii="Arial" w:hAnsi="Arial"/>
+          <w:i w:val="0"/>
+          <w:sz w:val="22"/>
+        </w:rPr>
+        <w:t>A Multa Preliminar de R$ 63.606.726,60 está entre o piso (R$ 60M) e o teto (R$ 212M) — não sofre ajuste.</w:t>
+      </w:r>
+    </w:p>
+    <w:p>
+      <w:pPr>
+        <w:spacing w:before="80" w:after="80"/>
+        <w:ind w:left="850" w:right="567"/>
+      </w:pPr>
+      <w:r>
+        <w:rPr>
+          <w:rFonts w:ascii="Arial" w:hAnsi="Arial"/>
+          <w:i/>
+          <w:color w:val="333366"/>
+          <w:sz w:val="20"/>
+        </w:rPr>
+        <w:t>MULTA FINAL (Caso I)  =  R$ 63.606.726,60</w:t>
+      </w:r>
+    </w:p>
+    <w:p>
+      <w:pPr>
+        <w:spacing w:before="160" w:after="40"/>
+      </w:pPr>
+      <w:r>
+        <w:rPr>
+          <w:rFonts w:ascii="Arial" w:hAnsi="Arial"/>
+          <w:b/>
+          <w:color w:val="1D3A78"/>
+          <w:sz w:val="22"/>
+        </w:rPr>
+        <w:t>Passo 6 — Publicação Extraordinária</w:t>
+      </w:r>
+    </w:p>
+    <w:p>
+      <w:pPr>
+        <w:spacing w:before="0" w:after="80"/>
+      </w:pPr>
+      <w:r>
+        <w:rPr>
+          <w:rFonts w:ascii="Arial" w:hAnsi="Arial"/>
+          <w:i w:val="0"/>
+          <w:sz w:val="22"/>
+        </w:rPr>
+        <w:t>Multa não foi limitada (Cenário A). Alíquota de referência = 6,0% → faixa "maior que 5,0% até 7,5%" → PRAZO: 60 DIAS.</w:t>
+      </w:r>
+    </w:p>
+    <w:p>
+      <w:pPr>
+        <w:spacing w:before="240" w:after="80"/>
+        <w:pBdr>
+          <w:bottom w:val="single" w:sz="6" w:space="1" w:color="64A70B"/>
+        </w:pBdr>
+      </w:pPr>
+      <w:r>
+        <w:rPr>
+          <w:rFonts w:ascii="Arial" w:hAnsi="Arial"/>
+          <w:b/>
+          <w:color w:val="1D3A78"/>
+          <w:sz w:val="23"/>
+        </w:rPr>
+        <w:t>14.2 Caso II — Mesmo Cenário, Vantagem Auferida Integral (Piso Forçado)</w:t>
+      </w:r>
+    </w:p>
+    <w:p>
+      <w:pPr>
+        <w:spacing w:before="160" w:after="40"/>
+      </w:pPr>
+      <w:r>
+        <w:rPr>
+          <w:rFonts w:ascii="Arial" w:hAnsi="Arial"/>
+          <w:b/>
+          <w:color w:val="1D3A78"/>
+          <w:sz w:val="22"/>
+        </w:rPr>
+        <w:t>Variante</w:t>
+      </w:r>
+    </w:p>
+    <w:p>
+      <w:pPr>
+        <w:spacing w:before="0" w:after="80"/>
+      </w:pPr>
+      <w:r>
+        <w:rPr>
+          <w:rFonts w:ascii="Arial" w:hAnsi="Arial"/>
+          <w:i w:val="0"/>
+          <w:sz w:val="22"/>
+        </w:rPr>
+        <w:t>A vantagem auferida permanece em R$ 90.000.000,00 (sem redução pela refiscalização).</w:t>
+      </w:r>
+    </w:p>
+    <w:tbl>
+      <w:tblPr>
+        <w:tblStyle w:val="TableGrid"/>
+        <w:tblW w:type="auto" w:w="0"/>
+        <w:jc w:val="left"/>
+        <w:tblLook w:firstColumn="1" w:firstRow="1" w:lastColumn="0" w:lastRow="0" w:noHBand="0" w:noVBand="1" w:val="04A0"/>
+      </w:tblPr>
+      <w:tblGrid>
+        <w:gridCol w:w="4702"/>
+        <w:gridCol w:w="4702"/>
+      </w:tblGrid>
+      <w:tr>
+        <w:tc>
+          <w:tcPr>
+            <w:tcW w:type="dxa" w:w="5102"/>
+            <w:shd w:val="clear" w:color="auto" w:fill="00205B"/>
+          </w:tcPr>
+          <w:p>
+            <w:pPr>
+              <w:jc w:val="center"/>
+            </w:pPr>
+            <w:r>
+              <w:rPr>
+                <w:rFonts w:ascii="Arial" w:hAnsi="Arial"/>
+                <w:b/>
+                <w:color w:val="FFFFFF"/>
+                <w:sz w:val="20"/>
+              </w:rPr>
+              <w:t>Limite</w:t>
+            </w:r>
+          </w:p>
+        </w:tc>
+        <w:tc>
+          <w:tcPr>
+            <w:tcW w:type="dxa" w:w="4535"/>
+            <w:shd w:val="clear" w:color="auto" w:fill="00205B"/>
+          </w:tcPr>
+          <w:p>
+            <w:pPr>
+              <w:jc w:val="center"/>
+            </w:pPr>
+            <w:r>
+              <w:rPr>
+                <w:rFonts w:ascii="Arial" w:hAnsi="Arial"/>
+                <w:b/>
+                <w:color w:val="FFFFFF"/>
+                <w:sz w:val="20"/>
+              </w:rPr>
+              <w:t>Valor</w:t>
+            </w:r>
+          </w:p>
+        </w:tc>
+      </w:tr>
+      <w:tr>
+        <w:tc>
+          <w:tcPr>
+            <w:tcW w:type="dxa" w:w="5102"/>
+            <w:shd w:val="clear" w:color="auto" w:fill="F2F2F2"/>
+          </w:tcPr>
+          <w:p>
+            <w:pPr>
+              <w:jc w:val="left"/>
+            </w:pPr>
+            <w:r>
+              <w:rPr>
+                <w:rFonts w:ascii="Arial" w:hAnsi="Arial"/>
+                <w:sz w:val="20"/>
+              </w:rPr>
+              <w:t>Piso (vantagem auferida integral)</w:t>
+            </w:r>
+          </w:p>
+        </w:tc>
+        <w:tc>
+          <w:tcPr>
+            <w:tcW w:type="dxa" w:w="4535"/>
+            <w:shd w:val="clear" w:color="auto" w:fill="F2F2F2"/>
+          </w:tcPr>
+          <w:p>
+            <w:pPr>
+              <w:jc w:val="center"/>
+            </w:pPr>
+            <w:r>
+              <w:rPr>
+                <w:rFonts w:ascii="Arial" w:hAnsi="Arial"/>
+                <w:sz w:val="20"/>
+              </w:rPr>
+              <w:t>R$ 90.000.000,00</w:t>
+            </w:r>
+          </w:p>
+        </w:tc>
+      </w:tr>
+      <w:tr>
+        <w:tc>
+          <w:tcPr>
+            <w:tcW w:type="dxa" w:w="5102"/>
+            <w:shd w:val="clear" w:color="auto" w:fill="FFFFFF"/>
+          </w:tcPr>
+          <w:p>
+            <w:pPr>
+              <w:jc w:val="left"/>
+            </w:pPr>
+            <w:r>
+              <w:rPr>
+                <w:rFonts w:ascii="Arial" w:hAnsi="Arial"/>
+                <w:sz w:val="20"/>
+              </w:rPr>
+              <w:t>Teto (20% do Faturamento)</w:t>
+            </w:r>
+          </w:p>
+        </w:tc>
+        <w:tc>
+          <w:tcPr>
+            <w:tcW w:type="dxa" w:w="4535"/>
+            <w:shd w:val="clear" w:color="auto" w:fill="FFFFFF"/>
+          </w:tcPr>
+          <w:p>
+            <w:pPr>
+              <w:jc w:val="center"/>
+            </w:pPr>
+            <w:r>
+              <w:rPr>
+                <w:rFonts w:ascii="Arial" w:hAnsi="Arial"/>
+                <w:sz w:val="20"/>
+              </w:rPr>
+              <w:t>R$ 212.022.422,00</w:t>
+            </w:r>
+          </w:p>
+        </w:tc>
+      </w:tr>
+    </w:tbl>
+    <w:p/>
+    <w:p>
+      <w:pPr>
+        <w:spacing w:before="0" w:after="80"/>
+      </w:pPr>
+      <w:r>
+        <w:rPr>
+          <w:rFonts w:ascii="Arial" w:hAnsi="Arial"/>
+          <w:i w:val="0"/>
+          <w:sz w:val="22"/>
+        </w:rPr>
+        <w:t>Multa Preliminar de R$ 63.606.726,60 ficou abaixo do piso legal (R$ 90M). A multa é elevada obrigatoriamente ao piso:</w:t>
+      </w:r>
+    </w:p>
+    <w:p>
+      <w:pPr>
+        <w:spacing w:before="80" w:after="80"/>
+        <w:ind w:left="850" w:right="567"/>
+      </w:pPr>
+      <w:r>
+        <w:rPr>
+          <w:rFonts w:ascii="Arial" w:hAnsi="Arial"/>
+          <w:i/>
+          <w:color w:val="333366"/>
+          <w:sz w:val="20"/>
+        </w:rPr>
+        <w:t>MULTA FINAL (Caso II)  =  R$ 90.000.000,00</w:t>
+      </w:r>
+    </w:p>
+    <w:p>
+      <w:pPr>
+        <w:spacing w:before="160" w:after="40"/>
+      </w:pPr>
+      <w:r>
+        <w:rPr>
+          <w:rFonts w:ascii="Arial" w:hAnsi="Arial"/>
+          <w:b/>
+          <w:color w:val="1D3A78"/>
+          <w:sz w:val="22"/>
+        </w:rPr>
+        <w:t>Publicação com Proporção Recalculada (Cenário B)</w:t>
+      </w:r>
+    </w:p>
+    <w:p>
+      <w:pPr>
+        <w:spacing w:before="80" w:after="80"/>
+        <w:ind w:left="850" w:right="567"/>
+      </w:pPr>
+      <w:r>
+        <w:rPr>
+          <w:rFonts w:ascii="Arial" w:hAnsi="Arial"/>
+          <w:i/>
+          <w:color w:val="333366"/>
+          <w:sz w:val="20"/>
+        </w:rPr>
+        <w:t>Alíquota de Proporção  =  R$ 90.000.000,00 ÷ R$ 1.060.112.110,00  ≈  8,5%  →  PRAZO: 75 DIAS</w:t>
+      </w:r>
+    </w:p>
+    <w:tbl>
+      <w:tblPr>
+        <w:tblStyle w:val="TableGrid"/>
+        <w:tblW w:type="auto" w:w="0"/>
+        <w:tblLook w:firstColumn="1" w:firstRow="1" w:lastColumn="0" w:lastRow="0" w:noHBand="0" w:noVBand="1" w:val="04A0"/>
+      </w:tblPr>
+      <w:tblGrid>
+        <w:gridCol w:w="9405"/>
+      </w:tblGrid>
+      <w:tr>
+        <w:tc>
+          <w:tcPr>
+            <w:tcW w:type="dxa" w:w="9405"/>
+            <w:shd w:val="clear" w:color="auto" w:fill="F2F2F2"/>
+            <w:tcBorders>
+              <w:bottom w:val="single" w:sz="6" w:space="0" w:color="64A70B"/>
+            </w:tcBorders>
+          </w:tcPr>
+          <w:p>
+            <w:r>
+              <w:rPr>
+                <w:rFonts w:ascii="Arial" w:hAnsi="Arial"/>
+                <w:color w:val="444400"/>
+                <w:sz w:val="20"/>
+              </w:rPr>
+              <w:t>⚠  O prazo de publicação aumentou de 60 para 75 dias porque a gravidade proporcional da sanção cresceu quando a multa foi elevada ao piso.</w:t>
+            </w:r>
+          </w:p>
+        </w:tc>
+      </w:tr>
+    </w:tbl>
+    <w:p/>
+    <w:p>
+      <w:pPr>
+        <w:spacing w:before="240" w:after="80"/>
+        <w:pBdr>
+          <w:bottom w:val="single" w:sz="6" w:space="1" w:color="64A70B"/>
+        </w:pBdr>
+      </w:pPr>
+      <w:r>
+        <w:rPr>
+          <w:rFonts w:ascii="Arial" w:hAnsi="Arial"/>
+          <w:b/>
+          <w:color w:val="1D3A78"/>
+          <w:sz w:val="23"/>
+        </w:rPr>
+        <w:t>14.3 Caso III — Empresa Cítrica: Sem Defesa, Empresa Fantasma</w:t>
+      </w:r>
+    </w:p>
+    <w:p>
+      <w:pPr>
+        <w:spacing w:before="160" w:after="40"/>
+      </w:pPr>
+      <w:r>
+        <w:rPr>
+          <w:rFonts w:ascii="Arial" w:hAnsi="Arial"/>
+          <w:b/>
+          <w:color w:val="1D3A78"/>
+          <w:sz w:val="22"/>
+        </w:rPr>
+        <w:t>Cenário</w:t>
+      </w:r>
+    </w:p>
+    <w:p>
+      <w:pPr>
+        <w:spacing w:before="0" w:after="80"/>
+      </w:pPr>
+      <w:r>
+        <w:rPr>
+          <w:rFonts w:ascii="Arial" w:hAnsi="Arial"/>
+          <w:i w:val="0"/>
+          <w:sz w:val="22"/>
+        </w:rPr>
+        <w:t>Empresa-noteira que não apresentou defesa nem balanço. Faturamento: 2024 e 2025 = R$ 0. Faturamento histórico: 2018 (jan–mar) = R$ 53.500,00; 2017 = R$ 560.000,00.</w:t>
+      </w:r>
+    </w:p>
+    <w:p>
+      <w:pPr>
+        <w:spacing w:before="160" w:after="40"/>
+      </w:pPr>
+      <w:r>
+        <w:rPr>
+          <w:rFonts w:ascii="Arial" w:hAnsi="Arial"/>
+          <w:b/>
+          <w:color w:val="1D3A78"/>
+          <w:sz w:val="22"/>
+        </w:rPr>
+        <w:t>Retroação e Atualização (Art. 21)</w:t>
+      </w:r>
+    </w:p>
+    <w:p>
+      <w:pPr>
+        <w:spacing w:before="80" w:after="80"/>
+        <w:ind w:left="850" w:right="567"/>
+      </w:pPr>
+      <w:r>
+        <w:rPr>
+          <w:rFonts w:ascii="Arial" w:hAnsi="Arial"/>
+          <w:i/>
+          <w:color w:val="333366"/>
+          <w:sz w:val="20"/>
+        </w:rPr>
+        <w:t>Base de Cálculo apurada e atualizada pelo IPCA até 31/12/2024  =  R$ 74.588,17</w:t>
+      </w:r>
+    </w:p>
+    <w:p>
+      <w:pPr>
+        <w:spacing w:before="160" w:after="40"/>
+      </w:pPr>
+      <w:r>
+        <w:rPr>
+          <w:rFonts w:ascii="Arial" w:hAnsi="Arial"/>
+          <w:b/>
+          <w:color w:val="1D3A78"/>
+          <w:sz w:val="22"/>
+        </w:rPr>
+        <w:t>Dosimetria</w:t>
+      </w:r>
+    </w:p>
+    <w:tbl>
+      <w:tblPr>
+        <w:tblStyle w:val="TableGrid"/>
+        <w:tblW w:type="auto" w:w="0"/>
+        <w:jc w:val="left"/>
+        <w:tblLook w:firstColumn="1" w:firstRow="1" w:lastColumn="0" w:lastRow="0" w:noHBand="0" w:noVBand="1" w:val="04A0"/>
+      </w:tblPr>
+      <w:tblGrid>
+        <w:gridCol w:w="4702"/>
+        <w:gridCol w:w="4702"/>
+      </w:tblGrid>
+      <w:tr>
+        <w:tc>
+          <w:tcPr>
+            <w:tcW w:type="dxa" w:w="7370"/>
+            <w:shd w:val="clear" w:color="auto" w:fill="00205B"/>
+          </w:tcPr>
+          <w:p>
+            <w:pPr>
+              <w:jc w:val="center"/>
+            </w:pPr>
+            <w:r>
+              <w:rPr>
+                <w:rFonts w:ascii="Arial" w:hAnsi="Arial"/>
+                <w:b/>
+                <w:color w:val="FFFFFF"/>
+                <w:sz w:val="20"/>
+              </w:rPr>
+              <w:t>Circunstância</w:t>
+            </w:r>
+          </w:p>
+        </w:tc>
+        <w:tc>
+          <w:tcPr>
+            <w:tcW w:type="dxa" w:w="2268"/>
+            <w:shd w:val="clear" w:color="auto" w:fill="00205B"/>
+          </w:tcPr>
+          <w:p>
+            <w:pPr>
+              <w:jc w:val="center"/>
+            </w:pPr>
+            <w:r>
+              <w:rPr>
+                <w:rFonts w:ascii="Arial" w:hAnsi="Arial"/>
+                <w:b/>
+                <w:color w:val="FFFFFF"/>
+                <w:sz w:val="20"/>
+              </w:rPr>
+              <w:t>%</w:t>
+            </w:r>
+          </w:p>
+        </w:tc>
+      </w:tr>
+      <w:tr>
+        <w:tc>
+          <w:tcPr>
+            <w:tcW w:type="dxa" w:w="7370"/>
+            <w:shd w:val="clear" w:color="auto" w:fill="F2F2F2"/>
+          </w:tcPr>
+          <w:p>
+            <w:pPr>
+              <w:jc w:val="left"/>
+            </w:pPr>
+            <w:r>
+              <w:rPr>
+                <w:rFonts w:ascii="Arial" w:hAnsi="Arial"/>
+                <w:sz w:val="20"/>
+              </w:rPr>
+              <w:t>Agravantes</w:t>
+            </w:r>
+          </w:p>
+        </w:tc>
+        <w:tc>
+          <w:tcPr>
+            <w:tcW w:type="dxa" w:w="2268"/>
+            <w:shd w:val="clear" w:color="auto" w:fill="F2F2F2"/>
+          </w:tcPr>
+          <w:p>
+            <w:pPr>
+              <w:jc w:val="center"/>
+            </w:pPr>
+            <w:r>
+              <w:rPr>
+                <w:rFonts w:ascii="Arial" w:hAnsi="Arial"/>
+                <w:sz w:val="20"/>
+              </w:rPr>
+              <w:t>0%</w:t>
+            </w:r>
+          </w:p>
+        </w:tc>
+      </w:tr>
+      <w:tr>
+        <w:tc>
+          <w:tcPr>
+            <w:tcW w:type="dxa" w:w="7370"/>
+            <w:shd w:val="clear" w:color="auto" w:fill="FFFFFF"/>
+          </w:tcPr>
+          <w:p>
+            <w:pPr>
+              <w:jc w:val="left"/>
+            </w:pPr>
+            <w:r>
+              <w:rPr>
+                <w:rFonts w:ascii="Arial" w:hAnsi="Arial"/>
+                <w:sz w:val="20"/>
+              </w:rPr>
+              <w:t>Art. 23, II — Inexistência de vantagem/dano comprovado</w:t>
+            </w:r>
+          </w:p>
+        </w:tc>
+        <w:tc>
+          <w:tcPr>
+            <w:tcW w:type="dxa" w:w="2268"/>
+            <w:shd w:val="clear" w:color="auto" w:fill="FFFFFF"/>
+          </w:tcPr>
+          <w:p>
+            <w:pPr>
+              <w:jc w:val="center"/>
+            </w:pPr>
+            <w:r>
+              <w:rPr>
+                <w:rFonts w:ascii="Arial" w:hAnsi="Arial"/>
+                <w:sz w:val="20"/>
+              </w:rPr>
+              <w:t>−1,0%</w:t>
+            </w:r>
+          </w:p>
+        </w:tc>
+      </w:tr>
+      <w:tr>
+        <w:tc>
+          <w:tcPr>
+            <w:tcW w:type="dxa" w:w="7370"/>
+            <w:shd w:val="clear" w:color="auto" w:fill="F2F2F2"/>
+          </w:tcPr>
+          <w:p>
+            <w:pPr>
+              <w:jc w:val="left"/>
+            </w:pPr>
+            <w:r>
+              <w:rPr>
+                <w:rFonts w:ascii="Arial" w:hAnsi="Arial"/>
+                <w:sz w:val="20"/>
+              </w:rPr>
+              <w:t>Alíquota Final (atenuantes &gt; agravantes)</w:t>
+            </w:r>
+          </w:p>
+        </w:tc>
+        <w:tc>
+          <w:tcPr>
+            <w:tcW w:type="dxa" w:w="2268"/>
+            <w:shd w:val="clear" w:color="auto" w:fill="F2F2F2"/>
+          </w:tcPr>
+          <w:p>
+            <w:pPr>
+              <w:jc w:val="center"/>
+            </w:pPr>
+            <w:r>
+              <w:rPr>
+                <w:rFonts w:ascii="Arial" w:hAnsi="Arial"/>
+                <w:sz w:val="20"/>
+              </w:rPr>
+              <w:t>0%</w:t>
+            </w:r>
+          </w:p>
+        </w:tc>
+      </w:tr>
+    </w:tbl>
+    <w:p/>
+    <w:p>
+      <w:pPr>
+        <w:spacing w:before="80" w:after="80"/>
+        <w:ind w:left="850" w:right="567"/>
+      </w:pPr>
+      <w:r>
+        <w:rPr>
+          <w:rFonts w:ascii="Arial" w:hAnsi="Arial"/>
+          <w:i/>
+          <w:color w:val="333366"/>
+          <w:sz w:val="20"/>
+        </w:rPr>
+        <w:t>Multa Preliminar  =  R$ 74.588,17 × 0%  =  R$ 0,00</w:t>
+      </w:r>
+    </w:p>
+    <w:p>
+      <w:pPr>
+        <w:spacing w:before="0" w:after="80"/>
+      </w:pPr>
+      <w:r>
+        <w:rPr>
+          <w:rFonts w:ascii="Arial" w:hAnsi="Arial"/>
+          <w:i w:val="0"/>
+          <w:sz w:val="22"/>
+        </w:rPr>
+        <w:t>Piso absoluto (Art. 20, §4º, Lei nº 12.846/2013):</w:t>
+      </w:r>
+    </w:p>
+    <w:p>
+      <w:pPr>
+        <w:spacing w:before="80" w:after="80"/>
+        <w:ind w:left="850" w:right="567"/>
+      </w:pPr>
+      <w:r>
+        <w:rPr>
+          <w:rFonts w:ascii="Arial" w:hAnsi="Arial"/>
+          <w:i/>
+          <w:color w:val="333366"/>
+          <w:sz w:val="20"/>
+        </w:rPr>
+        <w:t>MULTA FINAL (Caso III)  =  R$ 6.000,00</w:t>
+      </w:r>
+    </w:p>
+    <w:p>
+      <w:pPr>
+        <w:spacing w:before="80" w:after="80"/>
+        <w:ind w:left="850" w:right="567"/>
+      </w:pPr>
+      <w:r>
+        <w:rPr>
+          <w:rFonts w:ascii="Arial" w:hAnsi="Arial"/>
+          <w:i/>
+          <w:color w:val="333366"/>
+          <w:sz w:val="20"/>
+        </w:rPr>
+        <w:t>Alíquota de Proporção  =  R$ 6.000,00 ÷ R$ 74.588,17  ≈  8,0%  →  PRAZO: 75 DIAS</w:t>
+      </w:r>
+    </w:p>
+    <w:p>
+      <w:pPr>
+        <w:spacing w:before="240" w:after="80"/>
+        <w:pBdr>
+          <w:bottom w:val="single" w:sz="6" w:space="1" w:color="64A70B"/>
+        </w:pBdr>
+      </w:pPr>
+      <w:r>
+        <w:rPr>
+          <w:rFonts w:ascii="Arial" w:hAnsi="Arial"/>
+          <w:b/>
+          <w:color w:val="1D3A78"/>
+          <w:sz w:val="23"/>
+        </w:rPr>
+        <w:t>14.4 Caso IV — Empresa Gasparzinho: Estimativa Fundamentada</w:t>
+      </w:r>
+    </w:p>
+    <w:p>
+      <w:pPr>
+        <w:spacing w:before="160" w:after="40"/>
+      </w:pPr>
+      <w:r>
+        <w:rPr>
+          <w:rFonts w:ascii="Arial" w:hAnsi="Arial"/>
+          <w:b/>
+          <w:color w:val="1D3A78"/>
+          <w:sz w:val="22"/>
+        </w:rPr>
+        <w:t>Cenário</w:t>
+      </w:r>
+    </w:p>
+    <w:p>
+      <w:pPr>
+        <w:spacing w:before="0" w:after="80"/>
+      </w:pPr>
+      <w:r>
+        <w:rPr>
+          <w:rFonts w:ascii="Arial" w:hAnsi="Arial"/>
+          <w:i w:val="0"/>
+          <w:sz w:val="22"/>
+        </w:rPr>
+        <w:t>Empresa sem qualquer dado de faturamento histórico. Capital social (2017): R$ 50.000,00. CNAE: 6204-0/00 (Consultoria em TI). Sede: Não-Me-Toque/RS. Regime: Lucro Presumido.</w:t>
+      </w:r>
+    </w:p>
+    <w:tbl>
+      <w:tblPr>
+        <w:tblStyle w:val="TableGrid"/>
+        <w:tblW w:type="auto" w:w="0"/>
+        <w:jc w:val="left"/>
+        <w:tblLook w:firstColumn="1" w:firstRow="1" w:lastColumn="0" w:lastRow="0" w:noHBand="0" w:noVBand="1" w:val="04A0"/>
+      </w:tblPr>
+      <w:tblGrid>
+        <w:gridCol w:w="4702"/>
+        <w:gridCol w:w="4702"/>
+      </w:tblGrid>
+      <w:tr>
+        <w:tc>
+          <w:tcPr>
+            <w:tcW w:type="dxa" w:w="6236"/>
+            <w:shd w:val="clear" w:color="auto" w:fill="00205B"/>
+          </w:tcPr>
+          <w:p>
+            <w:pPr>
+              <w:jc w:val="center"/>
+            </w:pPr>
+            <w:r>
+              <w:rPr>
+                <w:rFonts w:ascii="Arial" w:hAnsi="Arial"/>
+                <w:b/>
+                <w:color w:val="FFFFFF"/>
+                <w:sz w:val="20"/>
+              </w:rPr>
+              <w:t>Item</w:t>
+            </w:r>
+          </w:p>
+        </w:tc>
+        <w:tc>
+          <w:tcPr>
+            <w:tcW w:type="dxa" w:w="3402"/>
+            <w:shd w:val="clear" w:color="auto" w:fill="00205B"/>
+          </w:tcPr>
+          <w:p>
+            <w:pPr>
+              <w:jc w:val="center"/>
+            </w:pPr>
+            <w:r>
+              <w:rPr>
+                <w:rFonts w:ascii="Arial" w:hAnsi="Arial"/>
+                <w:b/>
+                <w:color w:val="FFFFFF"/>
+                <w:sz w:val="20"/>
+              </w:rPr>
+              <w:t>Valor</w:t>
+            </w:r>
+          </w:p>
+        </w:tc>
+      </w:tr>
+      <w:tr>
+        <w:tc>
+          <w:tcPr>
+            <w:tcW w:type="dxa" w:w="6236"/>
+            <w:shd w:val="clear" w:color="auto" w:fill="F2F2F2"/>
+          </w:tcPr>
+          <w:p>
+            <w:pPr>
+              <w:jc w:val="left"/>
+            </w:pPr>
+            <w:r>
+              <w:rPr>
+                <w:rFonts w:ascii="Arial" w:hAnsi="Arial"/>
+                <w:sz w:val="20"/>
+              </w:rPr>
+              <w:t>Capital Social 2017 (proxy de faturamento)</w:t>
+            </w:r>
+          </w:p>
+        </w:tc>
+        <w:tc>
+          <w:tcPr>
+            <w:tcW w:type="dxa" w:w="3402"/>
+            <w:shd w:val="clear" w:color="auto" w:fill="F2F2F2"/>
+          </w:tcPr>
+          <w:p>
+            <w:pPr>
+              <w:jc w:val="center"/>
+            </w:pPr>
+            <w:r>
+              <w:rPr>
+                <w:rFonts w:ascii="Arial" w:hAnsi="Arial"/>
+                <w:sz w:val="20"/>
+              </w:rPr>
+              <w:t>R$ 50.000,00</w:t>
+            </w:r>
+          </w:p>
+        </w:tc>
+      </w:tr>
+      <w:tr>
+        <w:tc>
+          <w:tcPr>
+            <w:tcW w:type="dxa" w:w="6236"/>
+            <w:shd w:val="clear" w:color="auto" w:fill="FFFFFF"/>
+          </w:tcPr>
+          <w:p>
+            <w:pPr>
+              <w:jc w:val="left"/>
+            </w:pPr>
+            <w:r>
+              <w:rPr>
+                <w:rFonts w:ascii="Arial" w:hAnsi="Arial"/>
+                <w:sz w:val="20"/>
+              </w:rPr>
+              <w:t>(−) Tributos estimados: PIS 0,65% + COFINS 3% + ISS 3% = 6,65%</w:t>
+            </w:r>
+          </w:p>
+        </w:tc>
+        <w:tc>
+          <w:tcPr>
+            <w:tcW w:type="dxa" w:w="3402"/>
+            <w:shd w:val="clear" w:color="auto" w:fill="FFFFFF"/>
+          </w:tcPr>
+          <w:p>
+            <w:pPr>
+              <w:jc w:val="center"/>
+            </w:pPr>
+            <w:r>
+              <w:rPr>
+                <w:rFonts w:ascii="Arial" w:hAnsi="Arial"/>
+                <w:sz w:val="20"/>
+              </w:rPr>
+              <w:t>(R$ 3.325,00)</w:t>
+            </w:r>
+          </w:p>
+        </w:tc>
+      </w:tr>
+      <w:tr>
+        <w:tc>
+          <w:tcPr>
+            <w:tcW w:type="dxa" w:w="6236"/>
+            <w:shd w:val="clear" w:color="auto" w:fill="F2F2F2"/>
+          </w:tcPr>
+          <w:p>
+            <w:pPr>
+              <w:jc w:val="left"/>
+            </w:pPr>
+            <w:r>
+              <w:rPr>
+                <w:rFonts w:ascii="Arial" w:hAnsi="Arial"/>
+                <w:sz w:val="20"/>
+              </w:rPr>
+              <w:t>Base de Cálculo Histórica (2017)</w:t>
+            </w:r>
+          </w:p>
+        </w:tc>
+        <w:tc>
+          <w:tcPr>
+            <w:tcW w:type="dxa" w:w="3402"/>
+            <w:shd w:val="clear" w:color="auto" w:fill="F2F2F2"/>
+          </w:tcPr>
+          <w:p>
+            <w:pPr>
+              <w:jc w:val="center"/>
+            </w:pPr>
+            <w:r>
+              <w:rPr>
+                <w:rFonts w:ascii="Arial" w:hAnsi="Arial"/>
+                <w:sz w:val="20"/>
+              </w:rPr>
+              <w:t>R$ 46.675,00</w:t>
+            </w:r>
+          </w:p>
+        </w:tc>
+      </w:tr>
+      <w:tr>
+        <w:tc>
+          <w:tcPr>
+            <w:tcW w:type="dxa" w:w="6236"/>
+            <w:shd w:val="clear" w:color="auto" w:fill="FFFFFF"/>
+          </w:tcPr>
+          <w:p>
+            <w:pPr>
+              <w:jc w:val="left"/>
+            </w:pPr>
+            <w:r>
+              <w:rPr>
+                <w:rFonts w:ascii="Arial" w:hAnsi="Arial"/>
+                <w:sz w:val="20"/>
+              </w:rPr>
+              <w:t>Atualização IPCA até dez/2024</w:t>
+            </w:r>
+          </w:p>
+        </w:tc>
+        <w:tc>
+          <w:tcPr>
+            <w:tcW w:type="dxa" w:w="3402"/>
+            <w:shd w:val="clear" w:color="auto" w:fill="FFFFFF"/>
+          </w:tcPr>
+          <w:p>
+            <w:pPr>
+              <w:jc w:val="center"/>
+            </w:pPr>
+            <w:r>
+              <w:rPr>
+                <w:rFonts w:ascii="Arial" w:hAnsi="Arial"/>
+                <w:sz w:val="20"/>
+              </w:rPr>
+              <w:t>≈ R$ 67.417,43</w:t>
+            </w:r>
+          </w:p>
+        </w:tc>
+      </w:tr>
+    </w:tbl>
+    <w:p/>
+    <w:p>
+      <w:pPr>
+        <w:spacing w:before="80" w:after="80"/>
+        <w:ind w:left="850" w:right="567"/>
+      </w:pPr>
+      <w:r>
+        <w:rPr>
+          <w:rFonts w:ascii="Arial" w:hAnsi="Arial"/>
+          <w:i/>
+          <w:color w:val="333366"/>
+          <w:sz w:val="20"/>
+        </w:rPr>
+        <w:t>BASE DE CÁLCULO OFICIAL  =  R$ 67.417,43</w:t>
+      </w:r>
+    </w:p>
+    <w:p>
+      <w:pPr>
+        <w:spacing w:before="0" w:after="80"/>
+      </w:pPr>
+      <w:r>
+        <w:rPr>
+          <w:rFonts w:ascii="Arial" w:hAnsi="Arial"/>
+          <w:i w:val="0"/>
+          <w:sz w:val="22"/>
+        </w:rPr>
+        <w:t>A partir desse valor, a dosimetria (agravantes, atenuantes, limites legais) segue o fluxo padrão.</w:t>
+      </w:r>
+    </w:p>
+    <w:tbl>
+      <w:tblPr>
+        <w:tblStyle w:val="TableGrid"/>
+        <w:tblW w:type="auto" w:w="0"/>
+        <w:tblLook w:firstColumn="1" w:firstRow="1" w:lastColumn="0" w:lastRow="0" w:noHBand="0" w:noVBand="1" w:val="04A0"/>
+      </w:tblPr>
+      <w:tblGrid>
+        <w:gridCol w:w="9405"/>
+      </w:tblGrid>
+      <w:tr>
+        <w:tc>
+          <w:tcPr>
+            <w:tcW w:type="dxa" w:w="9405"/>
+            <w:shd w:val="clear" w:color="auto" w:fill="F2F2F2"/>
+            <w:tcBorders>
+              <w:bottom w:val="single" w:sz="6" w:space="0" w:color="64A70B"/>
+            </w:tcBorders>
+          </w:tcPr>
+          <w:p>
+            <w:r>
+              <w:rPr>
+                <w:rFonts w:ascii="Arial" w:hAnsi="Arial"/>
+                <w:color w:val="444400"/>
+                <w:sz w:val="20"/>
+              </w:rPr>
+              <w:t>⚠  Estimativa técnica não é arbitrária. Cada premissa (CNAE, carga tributária, capital social) deve ser formalmente documentada no processo.</w:t>
+            </w:r>
+          </w:p>
+        </w:tc>
+      </w:tr>
+    </w:tbl>
+    <w:p/>
     <w:p/>
     <w:p>
       <w:pPr>

</xml_diff>

<commit_message>
Atualiza manual (md/docx) conforme Manual CGU (3ª ed., jun/2026)
Incorpora ao manual teórico-prático as três mudanças de metodologia já
aplicadas à calculadora:

- Art. 22, III, "a": faixas de interrupção de serviço público com os
  limiares oficiais de 100 mil / 400 mil habitantes (Tabela 3.1),
  substituindo "vila/povoado" e 500 mil hab.
- Art. 23, III: colaboração como faixa discricionária (Tabela 6) —
  1-2 condições: 0,5% a 1,0%; 3 condições: 1,5% fixo — em vez de soma
  de 0,5% por condição.
- Art. 23, V: fator multiplicador de 1,25 (Portaria Conjunta CGU nº
  6/2022) sobre o resultado da planilha [COI × MPI] + APJ quando >= 1%,
  com teto de 5% aplicado depois do multiplicador.

Atualiza referências legais, FAQ, fluxo resumido, rodapé e rótulo de
versão (2026), mantendo a identidade visual institucional.

https://claude.ai/code/session_01GAjRh6KCPWWMhHbtvEWb7e
</commit_message>
<xml_diff>
--- a/Manual_Calculadora_PAR.docx
+++ b/Manual_Calculadora_PAR.docx
@@ -96,7 +96,7 @@
           <w:color w:val="444444"/>
           <w:sz w:val="22"/>
         </w:rPr>
-        <w:t>Versão 2025</w:t>
+        <w:t>Versão 2026 — Conforme Manual de Responsabilização de Entes Privados da CGU (3ª ed., jun/2026)</w:t>
       </w:r>
     </w:p>
     <w:p>
@@ -3632,6 +3632,34 @@
           <w:rFonts w:ascii="Arial" w:hAnsi="Arial"/>
           <w:sz w:val="22"/>
         </w:rPr>
+        <w:t>Manual de Responsabilização de Entes Privados da CGU (3ª ed., jun/2026) — metodologia oficial de dosimetria (Tabela 3.1: interrupção de serviço público; Tabela 6: colaboração);</w:t>
+      </w:r>
+    </w:p>
+    <w:p>
+      <w:pPr>
+        <w:pStyle w:val="ListBullet"/>
+        <w:spacing w:before="0" w:after="40"/>
+        <w:ind w:left="283"/>
+      </w:pPr>
+      <w:r>
+        <w:rPr>
+          <w:rFonts w:ascii="Arial" w:hAnsi="Arial"/>
+          <w:sz w:val="22"/>
+        </w:rPr>
+        <w:t>Portaria Conjunta CGU nº 6/2022 — Adendo nº 1 ao Manual Prático de Avaliação de Programa de Integridade; fator multiplicador de 1,25 (Art. 23, V);</w:t>
+      </w:r>
+    </w:p>
+    <w:p>
+      <w:pPr>
+        <w:pStyle w:val="ListBullet"/>
+        <w:spacing w:before="0" w:after="40"/>
+        <w:ind w:left="283"/>
+      </w:pPr>
+      <w:r>
+        <w:rPr>
+          <w:rFonts w:ascii="Arial" w:hAnsi="Arial"/>
+          <w:sz w:val="22"/>
+        </w:rPr>
         <w:t>Guia CGU de Responsabilização de Pessoas Jurídicas — parâmetros interpretativos e tabelas de referência;</w:t>
       </w:r>
     </w:p>
@@ -6706,7 +6734,7 @@
                 <w:rFonts w:ascii="Arial" w:hAnsi="Arial"/>
                 <w:sz w:val="20"/>
               </w:rPr>
-              <w:t>Ausência de interrupção</w:t>
+              <w:t>Ausência de interrupção no fornecimento de serviço público</w:t>
             </w:r>
           </w:p>
         </w:tc>
@@ -6744,7 +6772,7 @@
                 <w:rFonts w:ascii="Arial" w:hAnsi="Arial"/>
                 <w:sz w:val="20"/>
               </w:rPr>
-              <w:t>Até 1 semana ou vila/povoado</w:t>
+              <w:t>Até 1 semana, ou impacto em município com até 100 mil habitantes</w:t>
             </w:r>
           </w:p>
         </w:tc>
@@ -6782,7 +6810,7 @@
                 <w:rFonts w:ascii="Arial" w:hAnsi="Arial"/>
                 <w:sz w:val="20"/>
               </w:rPr>
-              <w:t>Até 2 semanas ou cidade até 500 mil hab.</w:t>
+              <w:t>Até 2 semanas, ou impacto em município com até 400 mil habitantes</w:t>
             </w:r>
           </w:p>
         </w:tc>
@@ -6820,7 +6848,7 @@
                 <w:rFonts w:ascii="Arial" w:hAnsi="Arial"/>
                 <w:sz w:val="20"/>
               </w:rPr>
-              <w:t>Até 3 semanas ou cidade +500 mil hab./Estado</w:t>
+              <w:t>Até 3 semanas, ou município com mais de 400 mil hab., ou mais de um município do mesmo Estado</w:t>
             </w:r>
           </w:p>
         </w:tc>
@@ -6858,7 +6886,7 @@
                 <w:rFonts w:ascii="Arial" w:hAnsi="Arial"/>
                 <w:sz w:val="20"/>
               </w:rPr>
-              <w:t>Mais de 4 semanas ou 2 ou mais Estados</w:t>
+              <w:t>Superior a 4 semanas, ou dois ou mais Estados, ou dois ou mais municípios com +400 mil hab.</w:t>
             </w:r>
           </w:p>
         </w:tc>
@@ -6877,6 +6905,38 @@
                 <w:sz w:val="20"/>
               </w:rPr>
               <w:t>4,0%</w:t>
+            </w:r>
+          </w:p>
+        </w:tc>
+      </w:tr>
+    </w:tbl>
+    <w:p/>
+    <w:tbl>
+      <w:tblPr>
+        <w:tblStyle w:val="TableGrid"/>
+        <w:tblW w:type="auto" w:w="0"/>
+        <w:tblLook w:firstColumn="1" w:firstRow="1" w:lastColumn="0" w:lastRow="0" w:noHBand="0" w:noVBand="1" w:val="04A0"/>
+      </w:tblPr>
+      <w:tblGrid>
+        <w:gridCol w:w="9405"/>
+      </w:tblGrid>
+      <w:tr>
+        <w:tc>
+          <w:tcPr>
+            <w:tcW w:type="dxa" w:w="9405"/>
+            <w:shd w:val="clear" w:color="auto" w:fill="F2F2F2"/>
+            <w:tcBorders>
+              <w:bottom w:val="single" w:sz="6" w:space="0" w:color="64A70B"/>
+            </w:tcBorders>
+          </w:tcPr>
+          <w:p>
+            <w:r>
+              <w:rPr>
+                <w:rFonts w:ascii="Arial" w:hAnsi="Arial"/>
+                <w:color w:val="444400"/>
+                <w:sz w:val="20"/>
+              </w:rPr>
+              <w:t>⚠  Atualização do Manual CGU (3ª ed., jun/2026), Tabela 3.1: os limiares de porte de município passam a ser 100 mil e 400 mil habitantes, substituindo os antigos critérios "vila/povoado" e de 500 mil habitantes.</w:t>
             </w:r>
           </w:p>
         </w:tc>
@@ -9101,7 +9161,7 @@
           <w:i w:val="0"/>
           <w:sz w:val="22"/>
         </w:rPr>
-        <w:t>Reconhecida ainda que não haja admissão de responsabilidade. Cada condição acrescenta 0,5%, com teto de 1,5% (condições cumuláveis):</w:t>
+        <w:t>Reconhecida ainda que não haja admissão de responsabilidade. Conforme a Tabela 6 do Manual CGU (3ª ed., jun/2026), a colaboração NÃO é soma fixa de 0,5% por condição, mas valoração por faixa:</w:t>
       </w:r>
     </w:p>
     <w:tbl>
@@ -9118,7 +9178,7 @@
       <w:tr>
         <w:tc>
           <w:tcPr>
-            <w:tcW w:type="dxa" w:w="7370"/>
+            <w:tcW w:type="dxa" w:w="2835"/>
             <w:shd w:val="clear" w:color="auto" w:fill="27AE60"/>
           </w:tcPr>
           <w:p>
@@ -9132,13 +9192,13 @@
                 <w:color w:val="FFFFFF"/>
                 <w:sz w:val="20"/>
               </w:rPr>
-              <w:t>Condição (cumulável)</w:t>
-            </w:r>
-          </w:p>
-        </w:tc>
-        <w:tc>
-          <w:tcPr>
-            <w:tcW w:type="dxa" w:w="1701"/>
+              <w:t>Condições factualmente presentes</w:t>
+            </w:r>
+          </w:p>
+        </w:tc>
+        <w:tc>
+          <w:tcPr>
+            <w:tcW w:type="dxa" w:w="6236"/>
             <w:shd w:val="clear" w:color="auto" w:fill="27AE60"/>
           </w:tcPr>
           <w:p>
@@ -9152,7 +9212,7 @@
                 <w:color w:val="FFFFFF"/>
                 <w:sz w:val="20"/>
               </w:rPr>
-              <w:t>%</w:t>
+              <w:t>Percentual</w:t>
             </w:r>
           </w:p>
         </w:tc>
@@ -9160,7 +9220,7 @@
       <w:tr>
         <w:tc>
           <w:tcPr>
-            <w:tcW w:type="dxa" w:w="7370"/>
+            <w:tcW w:type="dxa" w:w="2835"/>
             <w:shd w:val="clear" w:color="auto" w:fill="F2F2F2"/>
           </w:tcPr>
           <w:p>
@@ -9172,13 +9232,13 @@
                 <w:rFonts w:ascii="Arial" w:hAnsi="Arial"/>
                 <w:sz w:val="20"/>
               </w:rPr>
-              <w:t>Ausência de colaboração</w:t>
-            </w:r>
-          </w:p>
-        </w:tc>
-        <w:tc>
-          <w:tcPr>
-            <w:tcW w:type="dxa" w:w="1701"/>
+              <w:t>Nenhuma condição</w:t>
+            </w:r>
+          </w:p>
+        </w:tc>
+        <w:tc>
+          <w:tcPr>
+            <w:tcW w:type="dxa" w:w="6236"/>
             <w:shd w:val="clear" w:color="auto" w:fill="F2F2F2"/>
           </w:tcPr>
           <w:p>
@@ -9198,7 +9258,7 @@
       <w:tr>
         <w:tc>
           <w:tcPr>
-            <w:tcW w:type="dxa" w:w="7370"/>
+            <w:tcW w:type="dxa" w:w="2835"/>
             <w:shd w:val="clear" w:color="auto" w:fill="FFFFFF"/>
           </w:tcPr>
           <w:p>
@@ -9210,13 +9270,13 @@
                 <w:rFonts w:ascii="Arial" w:hAnsi="Arial"/>
                 <w:sz w:val="20"/>
               </w:rPr>
-              <w:t>Admitiu a prática do ato</w:t>
-            </w:r>
-          </w:p>
-        </w:tc>
-        <w:tc>
-          <w:tcPr>
-            <w:tcW w:type="dxa" w:w="1701"/>
+              <w:t>Uma ou duas condições</w:t>
+            </w:r>
+          </w:p>
+        </w:tc>
+        <w:tc>
+          <w:tcPr>
+            <w:tcW w:type="dxa" w:w="6236"/>
             <w:shd w:val="clear" w:color="auto" w:fill="FFFFFF"/>
           </w:tcPr>
           <w:p>
@@ -9228,7 +9288,7 @@
                 <w:rFonts w:ascii="Arial" w:hAnsi="Arial"/>
                 <w:sz w:val="20"/>
               </w:rPr>
-              <w:t>+0,5%</w:t>
+              <w:t>Faixa discricionária de 0,5% a 1,0% (fixada pela autoridade conforme a utilidade e relevância da colaboração)</w:t>
             </w:r>
           </w:p>
         </w:tc>
@@ -9236,7 +9296,7 @@
       <w:tr>
         <w:tc>
           <w:tcPr>
-            <w:tcW w:type="dxa" w:w="7370"/>
+            <w:tcW w:type="dxa" w:w="2835"/>
             <w:shd w:val="clear" w:color="auto" w:fill="F2F2F2"/>
           </w:tcPr>
           <w:p>
@@ -9248,13 +9308,13 @@
                 <w:rFonts w:ascii="Arial" w:hAnsi="Arial"/>
                 <w:sz w:val="20"/>
               </w:rPr>
-              <w:t>Forneceu elementos para a apuração</w:t>
-            </w:r>
-          </w:p>
-        </w:tc>
-        <w:tc>
-          <w:tcPr>
-            <w:tcW w:type="dxa" w:w="1701"/>
+              <w:t>As três condições, simultaneamente</w:t>
+            </w:r>
+          </w:p>
+        </w:tc>
+        <w:tc>
+          <w:tcPr>
+            <w:tcW w:type="dxa" w:w="6236"/>
             <w:shd w:val="clear" w:color="auto" w:fill="F2F2F2"/>
           </w:tcPr>
           <w:p>
@@ -9266,51 +9326,26 @@
                 <w:rFonts w:ascii="Arial" w:hAnsi="Arial"/>
                 <w:sz w:val="20"/>
               </w:rPr>
-              <w:t>+0,5%</w:t>
-            </w:r>
-          </w:p>
-        </w:tc>
-      </w:tr>
-      <w:tr>
-        <w:tc>
-          <w:tcPr>
-            <w:tcW w:type="dxa" w:w="7370"/>
-            <w:shd w:val="clear" w:color="auto" w:fill="FFFFFF"/>
-          </w:tcPr>
-          <w:p>
-            <w:pPr>
-              <w:jc w:val="left"/>
-            </w:pPr>
-            <w:r>
-              <w:rPr>
-                <w:rFonts w:ascii="Arial" w:hAnsi="Arial"/>
-                <w:sz w:val="20"/>
-              </w:rPr>
-              <w:t>Renunciou aos prazos processuais</w:t>
-            </w:r>
-          </w:p>
-        </w:tc>
-        <w:tc>
-          <w:tcPr>
-            <w:tcW w:type="dxa" w:w="1701"/>
-            <w:shd w:val="clear" w:color="auto" w:fill="FFFFFF"/>
-          </w:tcPr>
-          <w:p>
-            <w:pPr>
-              <w:jc w:val="center"/>
-            </w:pPr>
-            <w:r>
-              <w:rPr>
-                <w:rFonts w:ascii="Arial" w:hAnsi="Arial"/>
-                <w:sz w:val="20"/>
-              </w:rPr>
-              <w:t>+0,5%</w:t>
+              <w:t>1,5% fixo (sem discricionariedade)</w:t>
             </w:r>
           </w:p>
         </w:tc>
       </w:tr>
     </w:tbl>
     <w:p/>
+    <w:p>
+      <w:pPr>
+        <w:spacing w:before="0" w:after="80"/>
+      </w:pPr>
+      <w:r>
+        <w:rPr>
+          <w:rFonts w:ascii="Arial" w:hAnsi="Arial"/>
+          <w:i w:val="0"/>
+          <w:sz w:val="22"/>
+        </w:rPr>
+        <w:t>As três condições que se registram (fato objetivo): (i) admitiu a prática do ato; (ii) forneceu elementos para a apuração; (iii) renunciou aos prazos processuais.</w:t>
+      </w:r>
+    </w:p>
     <w:tbl>
       <w:tblPr>
         <w:tblStyle w:val="TableGrid"/>
@@ -9336,7 +9371,7 @@
                 <w:color w:val="444400"/>
                 <w:sz w:val="20"/>
               </w:rPr>
-              <w:t>⚠  A mera entrega de documentos exigidos por lei NÃO configura colaboração. Conta a utilidade de informações e provas adicionais e inéditas. Admitir o ato sem assumir a responsabilidade jurídica enquadra-se neste inciso (III); o inciso IV exige reconhecimento formal da responsabilidade objetiva.</w:t>
+              <w:t>⚠  Mudança de metodologia: a calculadora deixou de somar 0,5% por condição e passou a abrir um campo editável (faixa 0,5%–1,0%) quando há 1 ou 2 condições, travando em 1,5% quando há 3. A mera entrega de documentos exigidos por lei NÃO configura colaboração — conta a utilidade de informações e provas adicionais e inéditas. Admitir o ato sem assumir a responsabilidade jurídica enquadra-se neste inciso (III); o inciso IV exige reconhecimento formal da responsabilidade objetiva.</w:t>
             </w:r>
           </w:p>
         </w:tc>
@@ -9812,7 +9847,7 @@
           <w:color w:val="333366"/>
           <w:sz w:val="20"/>
         </w:rPr>
-        <w:t>Fórmula: [COI × MPI] + APJ   —   teto: 5%</w:t>
+        <w:t>Resultado da planilha = [COI × MPI] + APJ   →   se ≥ 1%, aplica-se × 1,25   →   Atenuante = min(resultado, 5%)</w:t>
       </w:r>
     </w:p>
     <w:p>
@@ -9828,6 +9863,263 @@
         <w:t>Onde: COI = Cultura Organizacional e Instâncias de Governança; MPI = Mecanismos, Políticas e Procedimentos de Integridade; APJ = Atuação da Pessoa Jurídica em relação ao ato lesivo.</w:t>
       </w:r>
     </w:p>
+    <w:p>
+      <w:pPr>
+        <w:spacing w:before="0" w:after="80"/>
+      </w:pPr>
+      <w:r>
+        <w:rPr>
+          <w:rFonts w:ascii="Arial" w:hAnsi="Arial"/>
+          <w:i w:val="0"/>
+          <w:sz w:val="22"/>
+        </w:rPr>
+        <w:t>Fator multiplicador de 1,25 (Portaria Conjunta CGU nº 6/2022 — Adendo nº 1 ao Manual Prático de Avaliação de PI): incide sobre o resultado da planilha sempre que este for igual ou superior a 1%. O teto de 5% é aplicado DEPOIS do multiplicador.</w:t>
+      </w:r>
+    </w:p>
+    <w:tbl>
+      <w:tblPr>
+        <w:tblStyle w:val="TableGrid"/>
+        <w:tblW w:type="auto" w:w="0"/>
+        <w:jc w:val="left"/>
+        <w:tblLook w:firstColumn="1" w:firstRow="1" w:lastColumn="0" w:lastRow="0" w:noHBand="0" w:noVBand="1" w:val="04A0"/>
+      </w:tblPr>
+      <w:tblGrid>
+        <w:gridCol w:w="3135"/>
+        <w:gridCol w:w="3135"/>
+        <w:gridCol w:w="3135"/>
+      </w:tblGrid>
+      <w:tr>
+        <w:tc>
+          <w:tcPr>
+            <w:tcW w:type="dxa" w:w="3402"/>
+            <w:shd w:val="clear" w:color="auto" w:fill="27AE60"/>
+          </w:tcPr>
+          <w:p>
+            <w:pPr>
+              <w:jc w:val="center"/>
+            </w:pPr>
+            <w:r>
+              <w:rPr>
+                <w:rFonts w:ascii="Arial" w:hAnsi="Arial"/>
+                <w:b/>
+                <w:color w:val="FFFFFF"/>
+                <w:sz w:val="20"/>
+              </w:rPr>
+              <w:t>Resultado da planilha</w:t>
+            </w:r>
+          </w:p>
+        </w:tc>
+        <w:tc>
+          <w:tcPr>
+            <w:tcW w:type="dxa" w:w="2835"/>
+            <w:shd w:val="clear" w:color="auto" w:fill="27AE60"/>
+          </w:tcPr>
+          <w:p>
+            <w:pPr>
+              <w:jc w:val="center"/>
+            </w:pPr>
+            <w:r>
+              <w:rPr>
+                <w:rFonts w:ascii="Arial" w:hAnsi="Arial"/>
+                <w:b/>
+                <w:color w:val="FFFFFF"/>
+                <w:sz w:val="20"/>
+              </w:rPr>
+              <w:t>Fator 1,25</w:t>
+            </w:r>
+          </w:p>
+        </w:tc>
+        <w:tc>
+          <w:tcPr>
+            <w:tcW w:type="dxa" w:w="3402"/>
+            <w:shd w:val="clear" w:color="auto" w:fill="27AE60"/>
+          </w:tcPr>
+          <w:p>
+            <w:pPr>
+              <w:jc w:val="center"/>
+            </w:pPr>
+            <w:r>
+              <w:rPr>
+                <w:rFonts w:ascii="Arial" w:hAnsi="Arial"/>
+                <w:b/>
+                <w:color w:val="FFFFFF"/>
+                <w:sz w:val="20"/>
+              </w:rPr>
+              <w:t>Resultado final</w:t>
+            </w:r>
+          </w:p>
+        </w:tc>
+      </w:tr>
+      <w:tr>
+        <w:tc>
+          <w:tcPr>
+            <w:tcW w:type="dxa" w:w="3402"/>
+            <w:shd w:val="clear" w:color="auto" w:fill="F2F2F2"/>
+          </w:tcPr>
+          <w:p>
+            <w:pPr>
+              <w:jc w:val="left"/>
+            </w:pPr>
+            <w:r>
+              <w:rPr>
+                <w:rFonts w:ascii="Arial" w:hAnsi="Arial"/>
+                <w:sz w:val="20"/>
+              </w:rPr>
+              <w:t>Inferior a 1% (ex.: 0,8%)</w:t>
+            </w:r>
+          </w:p>
+        </w:tc>
+        <w:tc>
+          <w:tcPr>
+            <w:tcW w:type="dxa" w:w="2835"/>
+            <w:shd w:val="clear" w:color="auto" w:fill="F2F2F2"/>
+          </w:tcPr>
+          <w:p>
+            <w:pPr>
+              <w:jc w:val="center"/>
+            </w:pPr>
+            <w:r>
+              <w:rPr>
+                <w:rFonts w:ascii="Arial" w:hAnsi="Arial"/>
+                <w:sz w:val="20"/>
+              </w:rPr>
+              <w:t>Não incide</w:t>
+            </w:r>
+          </w:p>
+        </w:tc>
+        <w:tc>
+          <w:tcPr>
+            <w:tcW w:type="dxa" w:w="3402"/>
+            <w:shd w:val="clear" w:color="auto" w:fill="F2F2F2"/>
+          </w:tcPr>
+          <w:p>
+            <w:pPr>
+              <w:jc w:val="center"/>
+            </w:pPr>
+            <w:r>
+              <w:rPr>
+                <w:rFonts w:ascii="Arial" w:hAnsi="Arial"/>
+                <w:sz w:val="20"/>
+              </w:rPr>
+              <w:t>0,8%</w:t>
+            </w:r>
+          </w:p>
+        </w:tc>
+      </w:tr>
+      <w:tr>
+        <w:tc>
+          <w:tcPr>
+            <w:tcW w:type="dxa" w:w="3402"/>
+            <w:shd w:val="clear" w:color="auto" w:fill="FFFFFF"/>
+          </w:tcPr>
+          <w:p>
+            <w:pPr>
+              <w:jc w:val="left"/>
+            </w:pPr>
+            <w:r>
+              <w:rPr>
+                <w:rFonts w:ascii="Arial" w:hAnsi="Arial"/>
+                <w:sz w:val="20"/>
+              </w:rPr>
+              <w:t>Igual ou superior a 1% (ex.: 1,0%)</w:t>
+            </w:r>
+          </w:p>
+        </w:tc>
+        <w:tc>
+          <w:tcPr>
+            <w:tcW w:type="dxa" w:w="2835"/>
+            <w:shd w:val="clear" w:color="auto" w:fill="FFFFFF"/>
+          </w:tcPr>
+          <w:p>
+            <w:pPr>
+              <w:jc w:val="center"/>
+            </w:pPr>
+            <w:r>
+              <w:rPr>
+                <w:rFonts w:ascii="Arial" w:hAnsi="Arial"/>
+                <w:sz w:val="20"/>
+              </w:rPr>
+              <w:t>Incide</w:t>
+            </w:r>
+          </w:p>
+        </w:tc>
+        <w:tc>
+          <w:tcPr>
+            <w:tcW w:type="dxa" w:w="3402"/>
+            <w:shd w:val="clear" w:color="auto" w:fill="FFFFFF"/>
+          </w:tcPr>
+          <w:p>
+            <w:pPr>
+              <w:jc w:val="center"/>
+            </w:pPr>
+            <w:r>
+              <w:rPr>
+                <w:rFonts w:ascii="Arial" w:hAnsi="Arial"/>
+                <w:sz w:val="20"/>
+              </w:rPr>
+              <w:t>1,25%</w:t>
+            </w:r>
+          </w:p>
+        </w:tc>
+      </w:tr>
+      <w:tr>
+        <w:tc>
+          <w:tcPr>
+            <w:tcW w:type="dxa" w:w="3402"/>
+            <w:shd w:val="clear" w:color="auto" w:fill="F2F2F2"/>
+          </w:tcPr>
+          <w:p>
+            <w:pPr>
+              <w:jc w:val="left"/>
+            </w:pPr>
+            <w:r>
+              <w:rPr>
+                <w:rFonts w:ascii="Arial" w:hAnsi="Arial"/>
+                <w:sz w:val="20"/>
+              </w:rPr>
+              <w:t>Próximo ao teto (ex.: 4,2%)</w:t>
+            </w:r>
+          </w:p>
+        </w:tc>
+        <w:tc>
+          <w:tcPr>
+            <w:tcW w:type="dxa" w:w="2835"/>
+            <w:shd w:val="clear" w:color="auto" w:fill="F2F2F2"/>
+          </w:tcPr>
+          <w:p>
+            <w:pPr>
+              <w:jc w:val="center"/>
+            </w:pPr>
+            <w:r>
+              <w:rPr>
+                <w:rFonts w:ascii="Arial" w:hAnsi="Arial"/>
+                <w:sz w:val="20"/>
+              </w:rPr>
+              <w:t>Incide, mas o teto prevalece</w:t>
+            </w:r>
+          </w:p>
+        </w:tc>
+        <w:tc>
+          <w:tcPr>
+            <w:tcW w:type="dxa" w:w="3402"/>
+            <w:shd w:val="clear" w:color="auto" w:fill="F2F2F2"/>
+          </w:tcPr>
+          <w:p>
+            <w:pPr>
+              <w:jc w:val="center"/>
+            </w:pPr>
+            <w:r>
+              <w:rPr>
+                <w:rFonts w:ascii="Arial" w:hAnsi="Arial"/>
+                <w:sz w:val="20"/>
+              </w:rPr>
+              <w:t>5,0% (4,2 × 1,25 = 5,25 → teto)</w:t>
+            </w:r>
+          </w:p>
+        </w:tc>
+      </w:tr>
+    </w:tbl>
+    <w:p/>
     <w:tbl>
       <w:tblPr>
         <w:tblStyle w:val="TableGrid"/>
@@ -9991,6 +10283,38 @@
                 <w:sz w:val="20"/>
               </w:rPr>
               <w:t>reduzido</w:t>
+            </w:r>
+          </w:p>
+        </w:tc>
+      </w:tr>
+    </w:tbl>
+    <w:p/>
+    <w:tbl>
+      <w:tblPr>
+        <w:tblStyle w:val="TableGrid"/>
+        <w:tblW w:type="auto" w:w="0"/>
+        <w:tblLook w:firstColumn="1" w:firstRow="1" w:lastColumn="0" w:lastRow="0" w:noHBand="0" w:noVBand="1" w:val="04A0"/>
+      </w:tblPr>
+      <w:tblGrid>
+        <w:gridCol w:w="9405"/>
+      </w:tblGrid>
+      <w:tr>
+        <w:tc>
+          <w:tcPr>
+            <w:tcW w:type="dxa" w:w="9405"/>
+            <w:shd w:val="clear" w:color="auto" w:fill="F2F2F2"/>
+            <w:tcBorders>
+              <w:bottom w:val="single" w:sz="6" w:space="0" w:color="64A70B"/>
+            </w:tcBorders>
+          </w:tcPr>
+          <w:p>
+            <w:r>
+              <w:rPr>
+                <w:rFonts w:ascii="Arial" w:hAnsi="Arial"/>
+                <w:color w:val="444400"/>
+                <w:sz w:val="20"/>
+              </w:rPr>
+              <w:t>⚠  A calculadora exibe o valor pré e pós-multiplicador no painel, no relatório e na minuta, para transparência do cálculo.</w:t>
             </w:r>
           </w:p>
         </w:tc>
@@ -13649,6 +13973,66 @@
       </w:r>
     </w:p>
     <w:p>
+      <w:pPr>
+        <w:spacing w:before="240" w:after="80"/>
+        <w:pBdr>
+          <w:bottom w:val="single" w:sz="6" w:space="1" w:color="64A70B"/>
+        </w:pBdr>
+      </w:pPr>
+      <w:r>
+        <w:rPr>
+          <w:rFonts w:ascii="Arial" w:hAnsi="Arial"/>
+          <w:b/>
+          <w:color w:val="1D3A78"/>
+          <w:sz w:val="23"/>
+        </w:rPr>
+        <w:t>Como a colaboração é valorada com 1, 2 ou 3 condições presentes? (atualização CGU 2026)</w:t>
+      </w:r>
+    </w:p>
+    <w:p>
+      <w:pPr>
+        <w:spacing w:before="0" w:after="80"/>
+      </w:pPr>
+      <w:r>
+        <w:rPr>
+          <w:rFonts w:ascii="Arial" w:hAnsi="Arial"/>
+          <w:i w:val="0"/>
+          <w:sz w:val="22"/>
+        </w:rPr>
+        <w:t>Conforme a Tabela 6 do Manual CGU, uma ou duas condições ensejam percentual discricionário de 0,5% a 1,0% (fixado pela autoridade conforme a utilidade da colaboração); as três condições, simultaneamente, ensejam 1,5% fixo. A calculadora abre um campo editável (faixa 0,5–1,0%) para 1 ou 2 condições e trava em 1,5% para 3 — não soma mais 0,5% por condição.</w:t>
+      </w:r>
+    </w:p>
+    <w:p>
+      <w:pPr>
+        <w:spacing w:before="240" w:after="80"/>
+        <w:pBdr>
+          <w:bottom w:val="single" w:sz="6" w:space="1" w:color="64A70B"/>
+        </w:pBdr>
+      </w:pPr>
+      <w:r>
+        <w:rPr>
+          <w:rFonts w:ascii="Arial" w:hAnsi="Arial"/>
+          <w:b/>
+          <w:color w:val="1D3A78"/>
+          <w:sz w:val="23"/>
+        </w:rPr>
+        <w:t>O que é o fator de 1,25 no Programa de Integridade? (atualização CGU 2026)</w:t>
+      </w:r>
+    </w:p>
+    <w:p>
+      <w:pPr>
+        <w:spacing w:before="0" w:after="80"/>
+      </w:pPr>
+      <w:r>
+        <w:rPr>
+          <w:rFonts w:ascii="Arial" w:hAnsi="Arial"/>
+          <w:i w:val="0"/>
+          <w:sz w:val="22"/>
+        </w:rPr>
+        <w:t>Conforme a Portaria Conjunta CGU nº 6/2022, ao resultado da planilha [COI × MPI] + APJ aplica-se um fator multiplicador de 1,25 sempre que esse resultado for igual ou superior a 1%, respeitado o teto de 5%. O fator não incide sobre resultados abaixo de 1%, e o teto de 5% é aplicado depois do multiplicador (ex.: 4,2% × 1,25 = 5,25% → limitado a 5,0%).</w:t>
+      </w:r>
+    </w:p>
+    <w:p>
       <w:r>
         <w:br w:type="page"/>
       </w:r>
@@ -17189,7 +17573,7 @@
         </w:rPr>
         <w:t>Manual elaborado com base na Calculadora de Multa PAR — Corregedoria da Receita Federal do Brasil</w:t>
         <w:br/>
-        <w:t>Fundamentos: Lei nº 12.846/2013 | Decreto nº 11.129/2022 | IN CGU nº 1/2015 | Guia CGU</w:t>
+        <w:t>Fundamentos: Lei nº 12.846/2013 | Decreto nº 11.129/2022 | IN CGU nº 1/2015 | Manual CGU (3ª ed., jun/2026) | Portaria Conjunta CGU nº 6/2022</w:t>
       </w:r>
     </w:p>
     <w:sectPr>

</xml_diff>